<commit_message>
Expand both review reports to use the full 25-page budget
Report 1: threat model + Mosca's inequality, worked example (two identical
RSA-2048 sites with different retention), 3 more papers (16 total), metric
definitions, risk register, responsible disclosure.

Report 2: preliminaries + formal problem formulation (Delta, the constrained
allocation programme, oracle regret), 3 more papers (17 total), metric
definitions, explicit GPU-day budget, risk register, reproducibility.

25 and 24 pages respectively, verified in Word.

Co-Authored-By: Claude Opus 5 (1M context) <noreply@anthropic.com>
</commit_message>
<xml_diff>
--- a/Report-1-Crypto-Agility-Copilot.docx
+++ b/Report-1-Crypto-Agility-Copilot.docx
@@ -2,7 +2,7 @@
 <file path=word/document.xml><?xml version="1.0" encoding="utf-8"?>
 <w:document xmlns:w="http://schemas.openxmlformats.org/wordprocessingml/2006/main" xmlns:m="http://schemas.openxmlformats.org/officeDocument/2006/math" xmlns:r="http://schemas.openxmlformats.org/officeDocument/2006/relationships" xmlns:o="urn:schemas-microsoft-com:office:office" xmlns:v="urn:schemas-microsoft-com:vml" xmlns:w10="urn:schemas-microsoft-com:office:word" xmlns:a="http://schemas.openxmlformats.org/drawingml/2006/main" xmlns:pic="http://schemas.openxmlformats.org/drawingml/2006/picture" xmlns:wp="http://schemas.openxmlformats.org/drawingml/2006/wordprocessingDrawing">
   <w:body>
-    <w:bookmarkStart w:id="64" w:name="review-report-i"/>
+    <w:bookmarkStart w:id="71" w:name="review-report-i"/>
     <w:p>
       <w:pPr>
         <w:pStyle w:val="Heading1"/>
@@ -90,7 +90,7 @@
       </w:r>
     </w:p>
     <w:bookmarkEnd w:id="20"/>
-    <w:bookmarkStart w:id="23" w:name="X13db0f51be05c2c6adc8066b9331d82b8e7ca05"/>
+    <w:bookmarkStart w:id="25" w:name="X13db0f51be05c2c6adc8066b9331d82b8e7ca05"/>
     <w:p>
       <w:pPr>
         <w:pStyle w:val="Heading2"/>
@@ -698,6 +698,878 @@
         <w:t xml:space="preserve">, and it is unanswered.</w:t>
       </w:r>
     </w:p>
+    <w:bookmarkEnd w:id="22"/>
+    <w:bookmarkStart w:id="23" w:name="Xc6cfec38c7a0faa1e82e2fdcad25e48ca0d336a"/>
+    <w:p>
+      <w:pPr>
+        <w:pStyle w:val="Heading3"/>
+      </w:pPr>
+      <w:r>
+        <w:t xml:space="preserve">1.3 Preliminaries and threat model</w:t>
+      </w:r>
+    </w:p>
+    <w:p>
+      <w:pPr>
+        <w:pStyle w:val="FirstParagraph"/>
+      </w:pPr>
+      <w:r>
+        <w:rPr>
+          <w:bCs/>
+          <w:b/>
+        </w:rPr>
+        <w:t xml:space="preserve">Cryptographic assets.</w:t>
+      </w:r>
+      <w:r>
+        <w:t xml:space="preserve"> </w:t>
+      </w:r>
+      <w:r>
+        <w:t xml:space="preserve">Following the CycloneDX 1.6 CBOM object model [P6], a cryptographic asset is</w:t>
+      </w:r>
+      <w:r>
+        <w:t xml:space="preserve"> </w:t>
+      </w:r>
+      <w:r>
+        <w:t xml:space="preserve">one of:</w:t>
+      </w:r>
+      <w:r>
+        <w:t xml:space="preserve"> </w:t>
+      </w:r>
+      <w:r>
+        <w:rPr>
+          <w:iCs/>
+          <w:i/>
+        </w:rPr>
+        <w:t xml:space="preserve">material</w:t>
+      </w:r>
+      <w:r>
+        <w:t xml:space="preserve"> </w:t>
+      </w:r>
+      <w:r>
+        <w:t xml:space="preserve">(keys, certificates, secrets),</w:t>
+      </w:r>
+      <w:r>
+        <w:t xml:space="preserve"> </w:t>
+      </w:r>
+      <w:r>
+        <w:rPr>
+          <w:iCs/>
+          <w:i/>
+        </w:rPr>
+        <w:t xml:space="preserve">artefacts</w:t>
+      </w:r>
+      <w:r>
+        <w:t xml:space="preserve"> </w:t>
+      </w:r>
+      <w:r>
+        <w:t xml:space="preserve">(protocol or file-format configuration),</w:t>
+      </w:r>
+      <w:r>
+        <w:t xml:space="preserve"> </w:t>
+      </w:r>
+      <w:r>
+        <w:t xml:space="preserve">or</w:t>
+      </w:r>
+      <w:r>
+        <w:t xml:space="preserve"> </w:t>
+      </w:r>
+      <w:r>
+        <w:rPr>
+          <w:iCs/>
+          <w:i/>
+        </w:rPr>
+        <w:t xml:space="preserve">invocations</w:t>
+      </w:r>
+      <w:r>
+        <w:t xml:space="preserve"> </w:t>
+      </w:r>
+      <w:r>
+        <w:t xml:space="preserve">(calls into a cryptographic API). Our analysis operates over invocations and the data</w:t>
+      </w:r>
+      <w:r>
+        <w:t xml:space="preserve"> </w:t>
+      </w:r>
+      <w:r>
+        <w:t xml:space="preserve">flowing through them, and consumes material and artefacts as context.</w:t>
+      </w:r>
+    </w:p>
+    <w:p>
+      <w:pPr>
+        <w:pStyle w:val="BodyText"/>
+      </w:pPr>
+      <w:r>
+        <w:rPr>
+          <w:bCs/>
+          <w:b/>
+        </w:rPr>
+        <w:t xml:space="preserve">Standardised replacements.</w:t>
+      </w:r>
+      <w:r>
+        <w:t xml:space="preserve"> </w:t>
+      </w:r>
+      <w:r>
+        <w:t xml:space="preserve">NIST FIPS 203 (ML-KEM, key encapsulation), FIPS 204 (ML-DSA,</w:t>
+      </w:r>
+      <w:r>
+        <w:t xml:space="preserve"> </w:t>
+      </w:r>
+      <w:r>
+        <w:t xml:space="preserve">lattice signatures) and FIPS 205 (SLH-DSA, hash-based signatures) are final. Deployment practice is</w:t>
+      </w:r>
+      <w:r>
+        <w:t xml:space="preserve"> </w:t>
+      </w:r>
+      <w:r>
+        <w:rPr>
+          <w:iCs/>
+          <w:i/>
+        </w:rPr>
+        <w:t xml:space="preserve">hybrid</w:t>
+      </w:r>
+      <w:r>
+        <w:t xml:space="preserve"> </w:t>
+      </w:r>
+      <w:r>
+        <w:t xml:space="preserve">— a classical and a post-quantum primitive combined so that security holds if either survives</w:t>
+      </w:r>
+      <w:r>
+        <w:t xml:space="preserve"> </w:t>
+      </w:r>
+      <w:r>
+        <w:t xml:space="preserve">(X25519 + ML-KEM for key establishment being the common construction). Hybrid deployment is what we</w:t>
+      </w:r>
+      <w:r>
+        <w:t xml:space="preserve"> </w:t>
+      </w:r>
+      <w:r>
+        <w:t xml:space="preserve">generate, and it is the conservative choice: a defect in the PQC implementation cannot make the system</w:t>
+      </w:r>
+      <w:r>
+        <w:t xml:space="preserve"> </w:t>
+      </w:r>
+      <w:r>
+        <w:t xml:space="preserve">worse than it was.</w:t>
+      </w:r>
+    </w:p>
+    <w:p>
+      <w:pPr>
+        <w:pStyle w:val="BodyText"/>
+      </w:pPr>
+      <w:r>
+        <w:rPr>
+          <w:bCs/>
+          <w:b/>
+        </w:rPr>
+        <w:t xml:space="preserve">Crypto-agility.</w:t>
+      </w:r>
+      <w:r>
+        <w:t xml:space="preserve"> </w:t>
+      </w:r>
+      <w:r>
+        <w:t xml:space="preserve">We adopt the operational definition: the property that a cryptographic primitive can</w:t>
+      </w:r>
+      <w:r>
+        <w:t xml:space="preserve"> </w:t>
+      </w:r>
+      <w:r>
+        <w:t xml:space="preserve">be replaced without redesigning the system that uses it. It is a property of</w:t>
+      </w:r>
+      <w:r>
+        <w:t xml:space="preserve"> </w:t>
+      </w:r>
+      <w:r>
+        <w:rPr>
+          <w:iCs/>
+          <w:i/>
+        </w:rPr>
+        <w:t xml:space="preserve">architecture</w:t>
+      </w:r>
+      <w:r>
+        <w:t xml:space="preserve">, not of</w:t>
+      </w:r>
+      <w:r>
+        <w:t xml:space="preserve"> </w:t>
+      </w:r>
+      <w:r>
+        <w:t xml:space="preserve">algorithm choice, which is why it is measurable from code and why CARS [P5] attempts to score it.</w:t>
+      </w:r>
+    </w:p>
+    <w:p>
+      <w:pPr>
+        <w:pStyle w:val="BodyText"/>
+      </w:pPr>
+      <w:r>
+        <w:rPr>
+          <w:bCs/>
+          <w:b/>
+        </w:rPr>
+        <w:t xml:space="preserve">Threat model.</w:t>
+      </w:r>
+      <w:r>
+        <w:t xml:space="preserve"> </w:t>
+      </w:r>
+      <w:r>
+        <w:t xml:space="preserve">The adversary is passive and patient. They cannot break RSA or ECC today. They can</w:t>
+      </w:r>
+      <w:r>
+        <w:t xml:space="preserve"> </w:t>
+      </w:r>
+      <w:r>
+        <w:t xml:space="preserve">(a) record ciphertext in transit or exfiltrate encrypted data at rest, (b) store it indefinitely at</w:t>
+      </w:r>
+      <w:r>
+        <w:t xml:space="preserve"> </w:t>
+      </w:r>
+      <w:r>
+        <w:t xml:space="preserve">negligible cost, and (c) decrypt it once a CRQC exists. They do not need to be detected, and detection</w:t>
+      </w:r>
+      <w:r>
+        <w:t xml:space="preserve"> </w:t>
+      </w:r>
+      <w:r>
+        <w:t xml:space="preserve">after the fact provides no remedy — this is the property that distinguishes HNDL from every other</w:t>
+      </w:r>
+      <w:r>
+        <w:t xml:space="preserve"> </w:t>
+      </w:r>
+      <w:r>
+        <w:t xml:space="preserve">vulnerability class, and the reason forward secrecy cannot help retroactively [P8].</w:t>
+      </w:r>
+    </w:p>
+    <w:p>
+      <w:pPr>
+        <w:pStyle w:val="BodyText"/>
+      </w:pPr>
+      <w:r>
+        <w:t xml:space="preserve">Formally,</w:t>
+      </w:r>
+      <w:r>
+        <w:t xml:space="preserve"> </w:t>
+      </w:r>
+      <w:r>
+        <w:rPr>
+          <w:bCs/>
+          <w:b/>
+        </w:rPr>
+        <w:t xml:space="preserve">Mosca's inequality</w:t>
+      </w:r>
+      <w:r>
+        <w:t xml:space="preserve">: for a given data path, let</w:t>
+      </w:r>
+      <w:r>
+        <w:t xml:space="preserve"> </w:t>
+      </w:r>
+      <w:r>
+        <w:rPr>
+          <w:iCs/>
+          <w:i/>
+        </w:rPr>
+        <w:t xml:space="preserve">x</w:t>
+      </w:r>
+      <w:r>
+        <w:t xml:space="preserve"> </w:t>
+      </w:r>
+      <w:r>
+        <w:t xml:space="preserve">be the required confidentiality</w:t>
+      </w:r>
+      <w:r>
+        <w:t xml:space="preserve"> </w:t>
+      </w:r>
+      <w:r>
+        <w:t xml:space="preserve">lifetime,</w:t>
+      </w:r>
+      <w:r>
+        <w:t xml:space="preserve"> </w:t>
+      </w:r>
+      <w:r>
+        <w:rPr>
+          <w:iCs/>
+          <w:i/>
+        </w:rPr>
+        <w:t xml:space="preserve">y</w:t>
+      </w:r>
+      <w:r>
+        <w:t xml:space="preserve"> </w:t>
+      </w:r>
+      <w:r>
+        <w:t xml:space="preserve">the time to migrate that path, and</w:t>
+      </w:r>
+      <w:r>
+        <w:t xml:space="preserve"> </w:t>
+      </w:r>
+      <w:r>
+        <w:rPr>
+          <w:iCs/>
+          <w:i/>
+        </w:rPr>
+        <w:t xml:space="preserve">z</w:t>
+      </w:r>
+      <w:r>
+        <w:t xml:space="preserve"> </w:t>
+      </w:r>
+      <w:r>
+        <w:t xml:space="preserve">the time until a CRQC exists. The path is</w:t>
+      </w:r>
+      <w:r>
+        <w:t xml:space="preserve"> </w:t>
+      </w:r>
+      <w:r>
+        <w:rPr>
+          <w:iCs/>
+          <w:i/>
+        </w:rPr>
+        <w:t xml:space="preserve">already breached</w:t>
+      </w:r>
+      <w:r>
+        <w:t xml:space="preserve"> </w:t>
+      </w:r>
+      <w:r>
+        <w:t xml:space="preserve">when</w:t>
+      </w:r>
+    </w:p>
+    <w:p>
+      <w:pPr>
+        <w:pStyle w:val="SourceCode"/>
+      </w:pPr>
+      <w:r>
+        <w:rPr>
+          <w:rStyle w:val="VerbatimChar"/>
+        </w:rPr>
+        <w:t xml:space="preserve">x + y &gt; z</w:t>
+      </w:r>
+    </w:p>
+    <w:p>
+      <w:pPr>
+        <w:pStyle w:val="FirstParagraph"/>
+      </w:pPr>
+      <w:r>
+        <w:t xml:space="preserve">Every term except</w:t>
+      </w:r>
+      <w:r>
+        <w:t xml:space="preserve"> </w:t>
+      </w:r>
+      <w:r>
+        <w:rPr>
+          <w:iCs/>
+          <w:i/>
+        </w:rPr>
+        <w:t xml:space="preserve">z</w:t>
+      </w:r>
+      <w:r>
+        <w:t xml:space="preserve"> </w:t>
+      </w:r>
+      <w:r>
+        <w:t xml:space="preserve">is a property of the specific data path, and both</w:t>
+      </w:r>
+      <w:r>
+        <w:t xml:space="preserve"> </w:t>
+      </w:r>
+      <w:r>
+        <w:rPr>
+          <w:iCs/>
+          <w:i/>
+        </w:rPr>
+        <w:t xml:space="preserve">x</w:t>
+      </w:r>
+      <w:r>
+        <w:t xml:space="preserve"> </w:t>
+      </w:r>
+      <w:r>
+        <w:t xml:space="preserve">and</w:t>
+      </w:r>
+      <w:r>
+        <w:t xml:space="preserve"> </w:t>
+      </w:r>
+      <w:r>
+        <w:rPr>
+          <w:iCs/>
+          <w:i/>
+        </w:rPr>
+        <w:t xml:space="preserve">y</w:t>
+      </w:r>
+      <w:r>
+        <w:t xml:space="preserve"> </w:t>
+      </w:r>
+      <w:r>
+        <w:t xml:space="preserve">are in principle</w:t>
+      </w:r>
+      <w:r>
+        <w:t xml:space="preserve"> </w:t>
+      </w:r>
+      <w:r>
+        <w:t xml:space="preserve">recoverable from code and configuration.</w:t>
+      </w:r>
+      <w:r>
+        <w:t xml:space="preserve"> </w:t>
+      </w:r>
+      <w:r>
+        <w:rPr>
+          <w:bCs/>
+          <w:b/>
+        </w:rPr>
+        <w:t xml:space="preserve">This is the observation the project rests on:</w:t>
+      </w:r>
+      <w:r>
+        <w:t xml:space="preserve"> </w:t>
+      </w:r>
+      <w:r>
+        <w:t xml:space="preserve">the</w:t>
+      </w:r>
+      <w:r>
+        <w:t xml:space="preserve"> </w:t>
+      </w:r>
+      <w:r>
+        <w:t xml:space="preserve">literature treats</w:t>
+      </w:r>
+      <w:r>
+        <w:t xml:space="preserve"> </w:t>
+      </w:r>
+      <w:r>
+        <w:rPr>
+          <w:iCs/>
+          <w:i/>
+        </w:rPr>
+        <w:t xml:space="preserve">x</w:t>
+      </w:r>
+      <w:r>
+        <w:t xml:space="preserve"> </w:t>
+      </w:r>
+      <w:r>
+        <w:t xml:space="preserve">as an input supplied by a human analyst, and we treat it as something to infer.</w:t>
+      </w:r>
+    </w:p>
+    <w:bookmarkEnd w:id="23"/>
+    <w:bookmarkStart w:id="24" w:name="X06ccd6c53e7d9b9129086edc759ec80d9fa706e"/>
+    <w:p>
+      <w:pPr>
+        <w:pStyle w:val="Heading3"/>
+      </w:pPr>
+      <w:r>
+        <w:t xml:space="preserve">1.4 A worked example</w:t>
+      </w:r>
+    </w:p>
+    <w:p>
+      <w:pPr>
+        <w:pStyle w:val="FirstParagraph"/>
+      </w:pPr>
+      <w:r>
+        <w:t xml:space="preserve">Two call sites in the same repository, matched by the same discovery rule and assigned the same</w:t>
+      </w:r>
+      <w:r>
+        <w:t xml:space="preserve"> </w:t>
+      </w:r>
+      <w:r>
+        <w:t xml:space="preserve">algorithm-severity score by every tool surveyed:</w:t>
+      </w:r>
+    </w:p>
+    <w:p>
+      <w:pPr>
+        <w:pStyle w:val="SourceCode"/>
+      </w:pPr>
+      <w:r>
+        <w:rPr>
+          <w:rStyle w:val="CommentTok"/>
+        </w:rPr>
+        <w:t xml:space="preserve"># A — payments/archive.py</w:t>
+      </w:r>
+      <w:r>
+        <w:br/>
+      </w:r>
+      <w:r>
+        <w:rPr>
+          <w:rStyle w:val="NormalTok"/>
+        </w:rPr>
+        <w:t xml:space="preserve">record </w:t>
+      </w:r>
+      <w:r>
+        <w:rPr>
+          <w:rStyle w:val="OperatorTok"/>
+        </w:rPr>
+        <w:t xml:space="preserve">=</w:t>
+      </w:r>
+      <w:r>
+        <w:rPr>
+          <w:rStyle w:val="NormalTok"/>
+        </w:rPr>
+        <w:t xml:space="preserve"> build_settlement_record(txn)              </w:t>
+      </w:r>
+      <w:r>
+        <w:rPr>
+          <w:rStyle w:val="CommentTok"/>
+        </w:rPr>
+        <w:t xml:space="preserve"># source: database read</w:t>
+      </w:r>
+      <w:r>
+        <w:br/>
+      </w:r>
+      <w:r>
+        <w:rPr>
+          <w:rStyle w:val="NormalTok"/>
+        </w:rPr>
+        <w:t xml:space="preserve">blob   </w:t>
+      </w:r>
+      <w:r>
+        <w:rPr>
+          <w:rStyle w:val="OperatorTok"/>
+        </w:rPr>
+        <w:t xml:space="preserve">=</w:t>
+      </w:r>
+      <w:r>
+        <w:rPr>
+          <w:rStyle w:val="NormalTok"/>
+        </w:rPr>
+        <w:t xml:space="preserve"> rsa_oaep_encrypt(record, archive_pubkey)  </w:t>
+      </w:r>
+      <w:r>
+        <w:rPr>
+          <w:rStyle w:val="CommentTok"/>
+        </w:rPr>
+        <w:t xml:space="preserve"># RSA-2048</w:t>
+      </w:r>
+      <w:r>
+        <w:br/>
+      </w:r>
+      <w:r>
+        <w:rPr>
+          <w:rStyle w:val="NormalTok"/>
+        </w:rPr>
+        <w:t xml:space="preserve">s3.put_object(Bucket</w:t>
+      </w:r>
+      <w:r>
+        <w:rPr>
+          <w:rStyle w:val="OperatorTok"/>
+        </w:rPr>
+        <w:t xml:space="preserve">=</w:t>
+      </w:r>
+      <w:r>
+        <w:rPr>
+          <w:rStyle w:val="StringTok"/>
+        </w:rPr>
+        <w:t xml:space="preserve">"settlements-archive"</w:t>
+      </w:r>
+      <w:r>
+        <w:rPr>
+          <w:rStyle w:val="NormalTok"/>
+        </w:rPr>
+        <w:t xml:space="preserve">,        </w:t>
+      </w:r>
+      <w:r>
+        <w:rPr>
+          <w:rStyle w:val="CommentTok"/>
+        </w:rPr>
+        <w:t xml:space="preserve"># sink: object store,</w:t>
+      </w:r>
+      <w:r>
+        <w:br/>
+      </w:r>
+      <w:r>
+        <w:rPr>
+          <w:rStyle w:val="NormalTok"/>
+        </w:rPr>
+        <w:t xml:space="preserve">              Key</w:t>
+      </w:r>
+      <w:r>
+        <w:rPr>
+          <w:rStyle w:val="OperatorTok"/>
+        </w:rPr>
+        <w:t xml:space="preserve">=</w:t>
+      </w:r>
+      <w:r>
+        <w:rPr>
+          <w:rStyle w:val="NormalTok"/>
+        </w:rPr>
+        <w:t xml:space="preserve">k, Body</w:t>
+      </w:r>
+      <w:r>
+        <w:rPr>
+          <w:rStyle w:val="OperatorTok"/>
+        </w:rPr>
+        <w:t xml:space="preserve">=</w:t>
+      </w:r>
+      <w:r>
+        <w:rPr>
+          <w:rStyle w:val="NormalTok"/>
+        </w:rPr>
+        <w:t xml:space="preserve">blob)                    </w:t>
+      </w:r>
+      <w:r>
+        <w:rPr>
+          <w:rStyle w:val="CommentTok"/>
+        </w:rPr>
+        <w:t xml:space="preserve"># lifecycle: retain 10 years</w:t>
+      </w:r>
+      <w:r>
+        <w:br/>
+      </w:r>
+      <w:r>
+        <w:br/>
+      </w:r>
+      <w:r>
+        <w:rPr>
+          <w:rStyle w:val="CommentTok"/>
+        </w:rPr>
+        <w:t xml:space="preserve"># B — web/session.py</w:t>
+      </w:r>
+      <w:r>
+        <w:br/>
+      </w:r>
+      <w:r>
+        <w:rPr>
+          <w:rStyle w:val="NormalTok"/>
+        </w:rPr>
+        <w:t xml:space="preserve">tok    </w:t>
+      </w:r>
+      <w:r>
+        <w:rPr>
+          <w:rStyle w:val="OperatorTok"/>
+        </w:rPr>
+        <w:t xml:space="preserve">=</w:t>
+      </w:r>
+      <w:r>
+        <w:rPr>
+          <w:rStyle w:val="NormalTok"/>
+        </w:rPr>
+        <w:t xml:space="preserve"> make_csrf_token()                         </w:t>
+      </w:r>
+      <w:r>
+        <w:rPr>
+          <w:rStyle w:val="CommentTok"/>
+        </w:rPr>
+        <w:t xml:space="preserve"># source: local RNG</w:t>
+      </w:r>
+      <w:r>
+        <w:br/>
+      </w:r>
+      <w:r>
+        <w:rPr>
+          <w:rStyle w:val="NormalTok"/>
+        </w:rPr>
+        <w:t xml:space="preserve">sealed </w:t>
+      </w:r>
+      <w:r>
+        <w:rPr>
+          <w:rStyle w:val="OperatorTok"/>
+        </w:rPr>
+        <w:t xml:space="preserve">=</w:t>
+      </w:r>
+      <w:r>
+        <w:rPr>
+          <w:rStyle w:val="NormalTok"/>
+        </w:rPr>
+        <w:t xml:space="preserve"> rsa_oaep_encrypt(tok, session_pubkey)     </w:t>
+      </w:r>
+      <w:r>
+        <w:rPr>
+          <w:rStyle w:val="CommentTok"/>
+        </w:rPr>
+        <w:t xml:space="preserve"># RSA-2048 — identical primitive</w:t>
+      </w:r>
+      <w:r>
+        <w:br/>
+      </w:r>
+      <w:r>
+        <w:rPr>
+          <w:rStyle w:val="NormalTok"/>
+        </w:rPr>
+        <w:t xml:space="preserve">redis.setex(k, </w:t>
+      </w:r>
+      <w:r>
+        <w:rPr>
+          <w:rStyle w:val="DecValTok"/>
+        </w:rPr>
+        <w:t xml:space="preserve">900</w:t>
+      </w:r>
+      <w:r>
+        <w:rPr>
+          <w:rStyle w:val="NormalTok"/>
+        </w:rPr>
+        <w:t xml:space="preserve">, sealed)                        </w:t>
+      </w:r>
+      <w:r>
+        <w:rPr>
+          <w:rStyle w:val="CommentTok"/>
+        </w:rPr>
+        <w:t xml:space="preserve"># sink: cache, TTL 900 s</w:t>
+      </w:r>
+    </w:p>
+    <w:p>
+      <w:pPr>
+        <w:pStyle w:val="FirstParagraph"/>
+      </w:pPr>
+      <w:r>
+        <w:t xml:space="preserve">Site</w:t>
+      </w:r>
+      <w:r>
+        <w:t xml:space="preserve"> </w:t>
+      </w:r>
+      <w:r>
+        <w:rPr>
+          <w:bCs/>
+          <w:b/>
+        </w:rPr>
+        <w:t xml:space="preserve">A</w:t>
+      </w:r>
+      <w:r>
+        <w:t xml:space="preserve"> </w:t>
+      </w:r>
+      <w:r>
+        <w:t xml:space="preserve">protects a financial record with a ten-year retention obligation, written to an</w:t>
+      </w:r>
+      <w:r>
+        <w:t xml:space="preserve"> </w:t>
+      </w:r>
+      <w:r>
+        <w:t xml:space="preserve">externally-reachable object store. Under Mosca's inequality with</w:t>
+      </w:r>
+      <w:r>
+        <w:t xml:space="preserve"> </w:t>
+      </w:r>
+      <w:r>
+        <w:rPr>
+          <w:iCs/>
+          <w:i/>
+        </w:rPr>
+        <w:t xml:space="preserve">x</w:t>
+      </w:r>
+      <w:r>
+        <w:t xml:space="preserve"> </w:t>
+      </w:r>
+      <w:r>
+        <w:t xml:space="preserve">= 10 years, it is already breached.</w:t>
+      </w:r>
+      <w:r>
+        <w:t xml:space="preserve"> </w:t>
+      </w:r>
+      <w:r>
+        <w:t xml:space="preserve">Site</w:t>
+      </w:r>
+      <w:r>
+        <w:t xml:space="preserve"> </w:t>
+      </w:r>
+      <w:r>
+        <w:rPr>
+          <w:bCs/>
+          <w:b/>
+        </w:rPr>
+        <w:t xml:space="preserve">B</w:t>
+      </w:r>
+      <w:r>
+        <w:t xml:space="preserve"> </w:t>
+      </w:r>
+      <w:r>
+        <w:t xml:space="preserve">protects a value that is worthless in fifteen minutes;</w:t>
+      </w:r>
+      <w:r>
+        <w:t xml:space="preserve"> </w:t>
+      </w:r>
+      <w:r>
+        <w:rPr>
+          <w:iCs/>
+          <w:i/>
+        </w:rPr>
+        <w:t xml:space="preserve">x</w:t>
+      </w:r>
+      <w:r>
+        <w:t xml:space="preserve"> </w:t>
+      </w:r>
+      <w:r>
+        <w:t xml:space="preserve">≈ 0, so migrating it delivers no</w:t>
+      </w:r>
+      <w:r>
+        <w:t xml:space="preserve"> </w:t>
+      </w:r>
+      <w:r>
+        <w:t xml:space="preserve">risk reduction whatsoever.</w:t>
+      </w:r>
+    </w:p>
+    <w:p>
+      <w:pPr>
+        <w:pStyle w:val="BodyText"/>
+      </w:pPr>
+      <w:r>
+        <w:t xml:space="preserve">Both sites are</w:t>
+      </w:r>
+      <w:r>
+        <w:t xml:space="preserve"> </w:t>
+      </w:r>
+      <w:r>
+        <w:rPr>
+          <w:rStyle w:val="VerbatimChar"/>
+        </w:rPr>
+        <w:t xml:space="preserve">RSA_OAEP</w:t>
+      </w:r>
+      <w:r>
+        <w:t xml:space="preserve"> </w:t>
+      </w:r>
+      <w:r>
+        <w:t xml:space="preserve">with a 2048-bit key. An algorithm-intrinsic score [P2] must rank them</w:t>
+      </w:r>
+      <w:r>
+        <w:t xml:space="preserve"> </w:t>
+      </w:r>
+      <w:r>
+        <w:t xml:space="preserve">identically. A pattern-matching inventory [P1] reports them identically. Yet the correct migration order</w:t>
+      </w:r>
+      <w:r>
+        <w:t xml:space="preserve"> </w:t>
+      </w:r>
+      <w:r>
+        <w:t xml:space="preserve">is unambiguous, and every piece of evidence needed to derive it —</w:t>
+      </w:r>
+      <w:r>
+        <w:t xml:space="preserve"> </w:t>
+      </w:r>
+      <w:r>
+        <w:rPr>
+          <w:rStyle w:val="VerbatimChar"/>
+        </w:rPr>
+        <w:t xml:space="preserve">s3.put_object</w:t>
+      </w:r>
+      <w:r>
+        <w:t xml:space="preserve"> </w:t>
+      </w:r>
+      <w:r>
+        <w:t xml:space="preserve">with a ten-year</w:t>
+      </w:r>
+      <w:r>
+        <w:t xml:space="preserve"> </w:t>
+      </w:r>
+      <w:r>
+        <w:t xml:space="preserve">lifecycle rule versus</w:t>
+      </w:r>
+      <w:r>
+        <w:t xml:space="preserve"> </w:t>
+      </w:r>
+      <w:r>
+        <w:rPr>
+          <w:rStyle w:val="VerbatimChar"/>
+        </w:rPr>
+        <w:t xml:space="preserve">setex</w:t>
+      </w:r>
+      <w:r>
+        <w:t xml:space="preserve"> </w:t>
+      </w:r>
+      <w:r>
+        <w:t xml:space="preserve">with a 900-second TTL, a database-derived source versus a locally</w:t>
+      </w:r>
+      <w:r>
+        <w:t xml:space="preserve"> </w:t>
+      </w:r>
+      <w:r>
+        <w:t xml:space="preserve">generated token — is present in the repository and machine-readable.</w:t>
+      </w:r>
+    </w:p>
+    <w:p>
+      <w:pPr>
+        <w:pStyle w:val="BodyText"/>
+      </w:pPr>
+      <w:r>
+        <w:rPr>
+          <w:bCs/>
+          <w:b/>
+        </w:rPr>
+        <w:t xml:space="preserve">That gap between "the information is in the code" and "no tool reads it" is the whole project.</w:t>
+      </w:r>
+    </w:p>
     <w:p>
       <w:r>
         <w:pict>
@@ -705,9 +1577,9 @@
         </w:pict>
       </w:r>
     </w:p>
-    <w:bookmarkEnd w:id="22"/>
-    <w:bookmarkEnd w:id="23"/>
-    <w:bookmarkStart w:id="24" w:name="X4680d8229330acf41d7956c750a49c2a51d3a53"/>
+    <w:bookmarkEnd w:id="24"/>
+    <w:bookmarkEnd w:id="25"/>
+    <w:bookmarkStart w:id="26" w:name="X4680d8229330acf41d7956c750a49c2a51d3a53"/>
     <w:p>
       <w:pPr>
         <w:pStyle w:val="Heading2"/>
@@ -1022,8 +1894,8 @@
         </w:pict>
       </w:r>
     </w:p>
-    <w:bookmarkEnd w:id="24"/>
-    <w:bookmarkStart w:id="25" w:name="X75c7fc3ae3409a2dc800748cd65d00ae33b40c8"/>
+    <w:bookmarkEnd w:id="26"/>
+    <w:bookmarkStart w:id="27" w:name="X75c7fc3ae3409a2dc800748cd65d00ae33b40c8"/>
     <w:p>
       <w:pPr>
         <w:pStyle w:val="Heading2"/>
@@ -1400,8 +2272,8 @@
         </w:pict>
       </w:r>
     </w:p>
-    <w:bookmarkEnd w:id="25"/>
-    <w:bookmarkStart w:id="29" w:name="X6613e4245a75e88013480f423ae1cd188d10e18"/>
+    <w:bookmarkEnd w:id="27"/>
+    <w:bookmarkStart w:id="31" w:name="X6613e4245a75e88013480f423ae1cd188d10e18"/>
     <w:p>
       <w:pPr>
         <w:pStyle w:val="Heading2"/>
@@ -1410,7 +2282,7 @@
         <w:t xml:space="preserve">4. Scope</w:t>
       </w:r>
     </w:p>
-    <w:bookmarkStart w:id="26" w:name="X88eb70fa65c0df7b6ed2e0dafb8314434f12b8a"/>
+    <w:bookmarkStart w:id="28" w:name="X88eb70fa65c0df7b6ed2e0dafb8314434f12b8a"/>
     <w:p>
       <w:pPr>
         <w:pStyle w:val="Heading3"/>
@@ -1571,8 +2443,8 @@
         <w:t xml:space="preserve">discovery accuracy, ranking quality, actionable precision, patch correctness.</w:t>
       </w:r>
     </w:p>
-    <w:bookmarkEnd w:id="26"/>
-    <w:bookmarkStart w:id="27" w:name="X0adebeaad0c4515e310ddbd871bd0bf7acf4b9b"/>
+    <w:bookmarkEnd w:id="28"/>
+    <w:bookmarkStart w:id="29" w:name="X0adebeaad0c4515e310ddbd871bd0bf7acf4b9b"/>
     <w:p>
       <w:pPr>
         <w:pStyle w:val="Heading3"/>
@@ -1762,8 +2634,8 @@
         <w:t xml:space="preserve">granularity.</w:t>
       </w:r>
     </w:p>
-    <w:bookmarkEnd w:id="27"/>
-    <w:bookmarkStart w:id="28" w:name="Xe504012a0f8a7b1835c8cdf9ea98fa2abbdf1cf"/>
+    <w:bookmarkEnd w:id="29"/>
+    <w:bookmarkStart w:id="30" w:name="Xe504012a0f8a7b1835c8cdf9ea98fa2abbdf1cf"/>
     <w:p>
       <w:pPr>
         <w:pStyle w:val="Heading3"/>
@@ -1804,9 +2676,9 @@
         <w:br w:type="page"/>
       </w:r>
     </w:p>
-    <w:bookmarkEnd w:id="28"/>
-    <w:bookmarkEnd w:id="29"/>
-    <w:bookmarkStart w:id="34" w:name="X9a2c4fc4bc2baa36c53eb8529b20250b02e6a8b"/>
+    <w:bookmarkEnd w:id="30"/>
+    <w:bookmarkEnd w:id="31"/>
+    <w:bookmarkStart w:id="36" w:name="X9a2c4fc4bc2baa36c53eb8529b20250b02e6a8b"/>
     <w:p>
       <w:pPr>
         <w:pStyle w:val="Heading2"/>
@@ -1815,7 +2687,7 @@
         <w:t xml:space="preserve">5. Preliminary Literature Survey</w:t>
       </w:r>
     </w:p>
-    <w:bookmarkStart w:id="30" w:name="Xb2991a02512283c1aa6eca57f78a646e6c69c19"/>
+    <w:bookmarkStart w:id="32" w:name="Xb2991a02512283c1aa6eca57f78a646e6c69c19"/>
     <w:p>
       <w:pPr>
         <w:pStyle w:val="Heading3"/>
@@ -1868,23 +2740,29 @@
         <w:t xml:space="preserve"> </w:t>
       </w:r>
       <w:r>
-        <w:t xml:space="preserve">two most recent scanner papers. Thirteen works were retained as directly load-bearing: eleven from</w:t>
-      </w:r>
-      <w:r>
-        <w:t xml:space="preserve"> </w:t>
-      </w:r>
-      <w:r>
-        <w:t xml:space="preserve">2025–2026, one 2024 pre-standardisation toolchain, and one 2019 classical baseline retained because</w:t>
-      </w:r>
-      <w:r>
-        <w:t xml:space="preserve"> </w:t>
-      </w:r>
-      <w:r>
-        <w:t xml:space="preserve">every modern paper positions against it.</w:t>
-      </w:r>
-    </w:p>
-    <w:bookmarkEnd w:id="30"/>
-    <w:bookmarkStart w:id="31" w:name="X81aadb64c9b2f4554cf65a8ea81cb8b1c1492a7"/>
+        <w:t xml:space="preserve">two most recent scanner papers. Sixteen works were retained as directly load-bearing: eleven from</w:t>
+      </w:r>
+      <w:r>
+        <w:t xml:space="preserve"> </w:t>
+      </w:r>
+      <w:r>
+        <w:t xml:space="preserve">2025–2026, three from 2024 (a pre-standardisation binary toolchain and a systematic literature review),</w:t>
+      </w:r>
+      <w:r>
+        <w:t xml:space="preserve"> </w:t>
+      </w:r>
+      <w:r>
+        <w:t xml:space="preserve">and two classical baselines from 2017 and 2019 retained because every modern paper positions against</w:t>
+      </w:r>
+      <w:r>
+        <w:t xml:space="preserve"> </w:t>
+      </w:r>
+      <w:r>
+        <w:t xml:space="preserve">them.</w:t>
+      </w:r>
+    </w:p>
+    <w:bookmarkEnd w:id="32"/>
+    <w:bookmarkStart w:id="33" w:name="X81aadb64c9b2f4554cf65a8ea81cb8b1c1492a7"/>
     <w:p>
       <w:pPr>
         <w:pStyle w:val="Heading3"/>
@@ -2915,9 +3793,216 @@
           </w:p>
         </w:tc>
       </w:tr>
+      <w:tr>
+        <w:tc>
+          <w:p>
+            <w:pPr>
+              <w:pStyle w:val="Compact"/>
+              <w:jc w:val="left"/>
+            </w:pPr>
+            <w:r>
+              <w:rPr>
+                <w:bCs/>
+                <w:b/>
+              </w:rPr>
+              <w:t xml:space="preserve">P14</w:t>
+            </w:r>
+          </w:p>
+        </w:tc>
+        <w:tc>
+          <w:p>
+            <w:pPr>
+              <w:pStyle w:val="Compact"/>
+              <w:jc w:val="left"/>
+            </w:pPr>
+            <w:r>
+              <w:t xml:space="preserve">Näther et al. —</w:t>
+            </w:r>
+            <w:r>
+              <w:t xml:space="preserve"> </w:t>
+            </w:r>
+            <w:r>
+              <w:rPr>
+                <w:iCs/>
+                <w:i/>
+              </w:rPr>
+              <w:t xml:space="preserve">Migrating Software Systems towards Post-Quantum Cryptography: A Systematic Literature Review</w:t>
+            </w:r>
+          </w:p>
+        </w:tc>
+        <w:tc>
+          <w:p>
+            <w:pPr>
+              <w:pStyle w:val="Compact"/>
+              <w:jc w:val="left"/>
+            </w:pPr>
+            <w:r>
+              <w:t xml:space="preserve">2024, arXiv 2404.12854</w:t>
+            </w:r>
+          </w:p>
+        </w:tc>
+        <w:tc>
+          <w:p>
+            <w:pPr>
+              <w:pStyle w:val="Compact"/>
+              <w:jc w:val="left"/>
+            </w:pPr>
+            <w:r>
+              <w:t xml:space="preserve">SLR extracting four migration phases, substeps and emerging role archetypes</w:t>
+            </w:r>
+          </w:p>
+        </w:tc>
+        <w:tc>
+          <w:p>
+            <w:pPr>
+              <w:pStyle w:val="Compact"/>
+              <w:jc w:val="left"/>
+            </w:pPr>
+            <w:r>
+              <w:t xml:space="preserve">Names three adopter obstacles: missing PQC experience and high realisation effort, security concerns about the new system, high complexity; finds terminology and steps "not defined precisely or consistently" and implementations "mostly experimental," yielding an "overall chaotic situation"</w:t>
+            </w:r>
+          </w:p>
+        </w:tc>
+      </w:tr>
+      <w:tr>
+        <w:tc>
+          <w:p>
+            <w:pPr>
+              <w:pStyle w:val="Compact"/>
+              <w:jc w:val="left"/>
+            </w:pPr>
+            <w:r>
+              <w:rPr>
+                <w:bCs/>
+                <w:b/>
+              </w:rPr>
+              <w:t xml:space="preserve">P15</w:t>
+            </w:r>
+          </w:p>
+        </w:tc>
+        <w:tc>
+          <w:p>
+            <w:pPr>
+              <w:pStyle w:val="Compact"/>
+              <w:jc w:val="left"/>
+            </w:pPr>
+            <w:r>
+              <w:rPr>
+                <w:iCs/>
+                <w:i/>
+              </w:rPr>
+              <w:t xml:space="preserve">Harvest Now, Decrypt Later: Examining Post-Quantum Risk</w:t>
+            </w:r>
+          </w:p>
+        </w:tc>
+        <w:tc>
+          <w:p>
+            <w:pPr>
+              <w:pStyle w:val="Compact"/>
+              <w:jc w:val="left"/>
+            </w:pPr>
+            <w:r>
+              <w:t xml:space="preserve">2025, Federal Reserve FEDS working paper series</w:t>
+            </w:r>
+          </w:p>
+        </w:tc>
+        <w:tc>
+          <w:p>
+            <w:pPr>
+              <w:pStyle w:val="Compact"/>
+              <w:jc w:val="left"/>
+            </w:pPr>
+            <w:r>
+              <w:t xml:space="preserve">Economic and financial-stability framing of HNDL exposure</w:t>
+            </w:r>
+          </w:p>
+        </w:tc>
+        <w:tc>
+          <w:p>
+            <w:pPr>
+              <w:pStyle w:val="Compact"/>
+              <w:jc w:val="left"/>
+            </w:pPr>
+            <w:r>
+              <w:t xml:space="preserve">Establishes HNDL as a supervisory concern for the financial sector independent of any CRQC date estimate</w:t>
+            </w:r>
+          </w:p>
+        </w:tc>
+      </w:tr>
+      <w:tr>
+        <w:tc>
+          <w:p>
+            <w:pPr>
+              <w:pStyle w:val="Compact"/>
+              <w:jc w:val="left"/>
+            </w:pPr>
+            <w:r>
+              <w:rPr>
+                <w:bCs/>
+                <w:b/>
+              </w:rPr>
+              <w:t xml:space="preserve">P16</w:t>
+            </w:r>
+          </w:p>
+        </w:tc>
+        <w:tc>
+          <w:p>
+            <w:pPr>
+              <w:pStyle w:val="Compact"/>
+              <w:jc w:val="left"/>
+            </w:pPr>
+            <w:r>
+              <w:t xml:space="preserve">Krüger et al. —</w:t>
+            </w:r>
+            <w:r>
+              <w:t xml:space="preserve"> </w:t>
+            </w:r>
+            <w:r>
+              <w:rPr>
+                <w:iCs/>
+                <w:i/>
+              </w:rPr>
+              <w:t xml:space="preserve">CogniCrypt</w:t>
+            </w:r>
+          </w:p>
+        </w:tc>
+        <w:tc>
+          <w:p>
+            <w:pPr>
+              <w:pStyle w:val="Compact"/>
+              <w:jc w:val="left"/>
+            </w:pPr>
+            <w:r>
+              <w:t xml:space="preserve">ASE 2017</w:t>
+            </w:r>
+          </w:p>
+        </w:tc>
+        <w:tc>
+          <w:p>
+            <w:pPr>
+              <w:pStyle w:val="Compact"/>
+              <w:jc w:val="left"/>
+            </w:pPr>
+            <w:r>
+              <w:t xml:space="preserve">Developer-facing generation of correct cryptographic code plus misuse analysis</w:t>
+            </w:r>
+          </w:p>
+        </w:tc>
+        <w:tc>
+          <w:p>
+            <w:pPr>
+              <w:pStyle w:val="Compact"/>
+              <w:jc w:val="left"/>
+            </w:pPr>
+            <w:r>
+              <w:t xml:space="preserve">The "help the developer write it correctly" line of work; 2026 evidence reports general-purpose LLMs now exceeding CogniCrypt, CryptoGuard and Snyk Code on misuse precision and recall</w:t>
+            </w:r>
+          </w:p>
+        </w:tc>
+      </w:tr>
     </w:tbl>
-    <w:bookmarkEnd w:id="31"/>
-    <w:bookmarkStart w:id="32" w:name="Xb842cc8cbf9d3889e4fecf6bc469a3ce68be21b"/>
+    <w:bookmarkEnd w:id="33"/>
+    <w:bookmarkStart w:id="34" w:name="Xb842cc8cbf9d3889e4fecf6bc469a3ce68be21b"/>
     <w:p>
       <w:pPr>
         <w:pStyle w:val="Heading3"/>
@@ -4267,8 +5352,390 @@
         <w:t xml:space="preserve">mechanism is bounded.</w:t>
       </w:r>
     </w:p>
-    <w:bookmarkEnd w:id="32"/>
-    <w:bookmarkStart w:id="33" w:name="Xf855654c98127d53ec548c743821ee5204023da"/>
+    <w:p>
+      <w:pPr>
+        <w:pStyle w:val="BodyText"/>
+      </w:pPr>
+      <w:r>
+        <w:rPr>
+          <w:bCs/>
+          <w:b/>
+        </w:rPr>
+        <w:t xml:space="preserve">P14 — the systematic literature review, and a revealing authorship overlap.</w:t>
+      </w:r>
+      <w:r>
+        <w:t xml:space="preserve"> </w:t>
+      </w:r>
+      <w:r>
+        <w:rPr>
+          <w:iCs/>
+          <w:i/>
+        </w:rPr>
+        <w:t xml:space="preserve">Flaw 1 (the field has no shared vocabulary, by the review's own finding).</w:t>
+      </w:r>
+      <w:r>
+        <w:t xml:space="preserve"> </w:t>
+      </w:r>
+      <w:r>
+        <w:t xml:space="preserve">Terminology, migration steps</w:t>
+      </w:r>
+      <w:r>
+        <w:t xml:space="preserve"> </w:t>
+      </w:r>
+      <w:r>
+        <w:t xml:space="preserve">and roles are "not defined precisely or consistently across the literature," implementations are</w:t>
+      </w:r>
+      <w:r>
+        <w:t xml:space="preserve"> </w:t>
+      </w:r>
+      <w:r>
+        <w:t xml:space="preserve">"mostly experimental," and the situation is characterised as "chaotic." A review that concludes the</w:t>
+      </w:r>
+      <w:r>
+        <w:t xml:space="preserve"> </w:t>
+      </w:r>
+      <w:r>
+        <w:t xml:space="preserve">field lacks agreed definitions cannot itself supply a measurable target.</w:t>
+      </w:r>
+      <w:r>
+        <w:t xml:space="preserve"> </w:t>
+      </w:r>
+      <w:r>
+        <w:rPr>
+          <w:iCs/>
+          <w:i/>
+        </w:rPr>
+        <w:t xml:space="preserve">Flaw 2 (phases without mechanisms).</w:t>
+      </w:r>
+      <w:r>
+        <w:t xml:space="preserve"> </w:t>
+      </w:r>
+      <w:r>
+        <w:t xml:space="preserve">Four migration phases and substeps are identified descriptively.</w:t>
+      </w:r>
+      <w:r>
+        <w:t xml:space="preserve"> </w:t>
+      </w:r>
+      <w:r>
+        <w:t xml:space="preserve">The review says</w:t>
+      </w:r>
+      <w:r>
+        <w:t xml:space="preserve"> </w:t>
+      </w:r>
+      <w:r>
+        <w:rPr>
+          <w:iCs/>
+          <w:i/>
+        </w:rPr>
+        <w:t xml:space="preserve">that</w:t>
+      </w:r>
+      <w:r>
+        <w:t xml:space="preserve"> </w:t>
+      </w:r>
+      <w:r>
+        <w:t xml:space="preserve">inventory and prioritisation are phases; it does not say how either is performed.</w:t>
+      </w:r>
+      <w:r>
+        <w:t xml:space="preserve"> </w:t>
+      </w:r>
+      <w:r>
+        <w:rPr>
+          <w:iCs/>
+          <w:i/>
+        </w:rPr>
+        <w:t xml:space="preserve">Flaw 3 (pre-standardisation).</w:t>
+      </w:r>
+      <w:r>
+        <w:t xml:space="preserve"> </w:t>
+      </w:r>
+      <w:r>
+        <w:t xml:space="preserve">Published April 2024, before FIPS 203/204/205 finalisation, so its</w:t>
+      </w:r>
+      <w:r>
+        <w:t xml:space="preserve"> </w:t>
+      </w:r>
+      <w:r>
+        <w:t xml:space="preserve">treatment of algorithm selection is dated.</w:t>
+      </w:r>
+      <w:r>
+        <w:t xml:space="preserve"> </w:t>
+      </w:r>
+      <w:r>
+        <w:rPr>
+          <w:bCs/>
+          <w:b/>
+        </w:rPr>
+        <w:t xml:space="preserve">The authorship point, which strengthens our case considerably.</w:t>
+      </w:r>
+      <w:r>
+        <w:t xml:space="preserve"> </w:t>
+      </w:r>
+      <w:r>
+        <w:t xml:space="preserve">The first author of this 2024 review</w:t>
+      </w:r>
+      <w:r>
+        <w:t xml:space="preserve"> </w:t>
+      </w:r>
+      <w:r>
+        <w:t xml:space="preserve">is also the first author of Crypsy [P1], the strongest 2026 scanner. The same group therefore (i)</w:t>
+      </w:r>
+      <w:r>
+        <w:t xml:space="preserve"> </w:t>
+      </w:r>
+      <w:r>
+        <w:t xml:space="preserve">surveyed the field and named its obstacles, then (ii) built a tool addressing discovery — and their own</w:t>
+      </w:r>
+      <w:r>
+        <w:t xml:space="preserve"> </w:t>
+      </w:r>
+      <w:r>
+        <w:t xml:space="preserve">2026 evaluation still reports actionable precision ≈ 0.3 with no dataflow and no prioritisation. The gap</w:t>
+      </w:r>
+      <w:r>
+        <w:t xml:space="preserve"> </w:t>
+      </w:r>
+      <w:r>
+        <w:t xml:space="preserve">we target has survived a dedicated review</w:t>
+      </w:r>
+      <w:r>
+        <w:t xml:space="preserve"> </w:t>
+      </w:r>
+      <w:r>
+        <w:rPr>
+          <w:iCs/>
+          <w:i/>
+        </w:rPr>
+        <w:t xml:space="preserve">and</w:t>
+      </w:r>
+      <w:r>
+        <w:t xml:space="preserve"> </w:t>
+      </w:r>
+      <w:r>
+        <w:t xml:space="preserve">a dedicated implementation by the people best placed to</w:t>
+      </w:r>
+      <w:r>
+        <w:t xml:space="preserve"> </w:t>
+      </w:r>
+      <w:r>
+        <w:t xml:space="preserve">close it. That is strong evidence the gap is real and non-trivial rather than merely unattempted.</w:t>
+      </w:r>
+      <w:r>
+        <w:t xml:space="preserve"> </w:t>
+      </w:r>
+      <w:r>
+        <w:rPr>
+          <w:bCs/>
+          <w:b/>
+        </w:rPr>
+        <w:t xml:space="preserve">Our correction.</w:t>
+      </w:r>
+      <w:r>
+        <w:t xml:space="preserve"> </w:t>
+      </w:r>
+      <w:r>
+        <w:t xml:space="preserve">We supply exactly the missing mechanism for the prioritisation phase P14 names, and</w:t>
+      </w:r>
+      <w:r>
+        <w:t xml:space="preserve"> </w:t>
+      </w:r>
+      <w:r>
+        <w:t xml:space="preserve">we commit to one precise, computable definition (the per-data-path exposure score) rather than adding</w:t>
+      </w:r>
+      <w:r>
+        <w:t xml:space="preserve"> </w:t>
+      </w:r>
+      <w:r>
+        <w:t xml:space="preserve">another informal one to a field the review already calls chaotic.</w:t>
+      </w:r>
+    </w:p>
+    <w:p>
+      <w:pPr>
+        <w:pStyle w:val="BodyText"/>
+      </w:pPr>
+      <w:r>
+        <w:rPr>
+          <w:bCs/>
+          <w:b/>
+        </w:rPr>
+        <w:t xml:space="preserve">P15 — Federal Reserve HNDL analysis.</w:t>
+      </w:r>
+      <w:r>
+        <w:t xml:space="preserve"> </w:t>
+      </w:r>
+      <w:r>
+        <w:rPr>
+          <w:iCs/>
+          <w:i/>
+        </w:rPr>
+        <w:t xml:space="preserve">Flaw:</w:t>
+      </w:r>
+      <w:r>
+        <w:t xml:space="preserve"> </w:t>
+      </w:r>
+      <w:r>
+        <w:t xml:space="preserve">it operates at the level of the financial system, establishing HNDL as a supervisory and</w:t>
+      </w:r>
+      <w:r>
+        <w:t xml:space="preserve"> </w:t>
+      </w:r>
+      <w:r>
+        <w:t xml:space="preserve">financial-stability concern. It has no view of any individual system, and its unit of analysis is an</w:t>
+      </w:r>
+      <w:r>
+        <w:t xml:space="preserve"> </w:t>
+      </w:r>
+      <w:r>
+        <w:t xml:space="preserve">institution, so it cannot inform an engineering decision.</w:t>
+      </w:r>
+      <w:r>
+        <w:t xml:space="preserve"> </w:t>
+      </w:r>
+      <w:r>
+        <w:rPr>
+          <w:bCs/>
+          <w:b/>
+        </w:rPr>
+        <w:t xml:space="preserve">Our correction.</w:t>
+      </w:r>
+      <w:r>
+        <w:t xml:space="preserve"> </w:t>
+      </w:r>
+      <w:r>
+        <w:t xml:space="preserve">We cite it strictly as institutional justification for §2.1 — evidence that a</w:t>
+      </w:r>
+      <w:r>
+        <w:t xml:space="preserve"> </w:t>
+      </w:r>
+      <w:r>
+        <w:t xml:space="preserve">central bank treats this exposure as material — and not as technical support. Our contribution is the</w:t>
+      </w:r>
+      <w:r>
+        <w:t xml:space="preserve"> </w:t>
+      </w:r>
+      <w:r>
+        <w:t xml:space="preserve">layer that converts an institution-level concern into a ranked engineering backlog.</w:t>
+      </w:r>
+    </w:p>
+    <w:p>
+      <w:pPr>
+        <w:pStyle w:val="BodyText"/>
+      </w:pPr>
+      <w:r>
+        <w:rPr>
+          <w:bCs/>
+          <w:b/>
+        </w:rPr>
+        <w:t xml:space="preserve">P16 — CogniCrypt.</w:t>
+      </w:r>
+      <w:r>
+        <w:t xml:space="preserve"> </w:t>
+      </w:r>
+      <w:r>
+        <w:rPr>
+          <w:iCs/>
+          <w:i/>
+        </w:rPr>
+        <w:t xml:space="preserve">Flaw 1 (wrong direction).</w:t>
+      </w:r>
+      <w:r>
+        <w:t xml:space="preserve"> </w:t>
+      </w:r>
+      <w:r>
+        <w:t xml:space="preserve">It helps a developer write</w:t>
+      </w:r>
+      <w:r>
+        <w:t xml:space="preserve"> </w:t>
+      </w:r>
+      <w:r>
+        <w:rPr>
+          <w:iCs/>
+          <w:i/>
+        </w:rPr>
+        <w:t xml:space="preserve">new</w:t>
+      </w:r>
+      <w:r>
+        <w:t xml:space="preserve"> </w:t>
+      </w:r>
+      <w:r>
+        <w:t xml:space="preserve">cryptographic code correctly. The</w:t>
+      </w:r>
+      <w:r>
+        <w:t xml:space="preserve"> </w:t>
+      </w:r>
+      <w:r>
+        <w:t xml:space="preserve">post-quantum problem is overwhelmingly about code that already exists, was written correctly by the</w:t>
+      </w:r>
+      <w:r>
+        <w:t xml:space="preserve"> </w:t>
+      </w:r>
+      <w:r>
+        <w:t xml:space="preserve">standards of its time, and is now obsolete for a reason unrelated to correctness.</w:t>
+      </w:r>
+      <w:r>
+        <w:t xml:space="preserve"> </w:t>
+      </w:r>
+      <w:r>
+        <w:rPr>
+          <w:iCs/>
+          <w:i/>
+        </w:rPr>
+        <w:t xml:space="preserve">Flaw 2 (superseded on its own task).</w:t>
+      </w:r>
+      <w:r>
+        <w:t xml:space="preserve"> </w:t>
+      </w:r>
+      <w:r>
+        <w:t xml:space="preserve">2026 evidence reports general-purpose LLMs exceeding CogniCrypt,</w:t>
+      </w:r>
+      <w:r>
+        <w:t xml:space="preserve"> </w:t>
+      </w:r>
+      <w:r>
+        <w:t xml:space="preserve">CryptoGuard and Snyk Code on misuse detection precision and recall, so the rule-based misuse-detection</w:t>
+      </w:r>
+      <w:r>
+        <w:t xml:space="preserve"> </w:t>
+      </w:r>
+      <w:r>
+        <w:t xml:space="preserve">approach is no longer the frontier even for its original purpose.</w:t>
+      </w:r>
+      <w:r>
+        <w:t xml:space="preserve"> </w:t>
+      </w:r>
+      <w:r>
+        <w:rPr>
+          <w:bCs/>
+          <w:b/>
+        </w:rPr>
+        <w:t xml:space="preserve">Our correction.</w:t>
+      </w:r>
+      <w:r>
+        <w:t xml:space="preserve"> </w:t>
+      </w:r>
+      <w:r>
+        <w:t xml:space="preserve">We treat correct-but-obsolete usage as the target class — the case all misuse</w:t>
+      </w:r>
+      <w:r>
+        <w:t xml:space="preserve"> </w:t>
+      </w:r>
+      <w:r>
+        <w:t xml:space="preserve">tooling is designed to ignore — and we use an LLM only inside a template-constrained, differentially</w:t>
+      </w:r>
+      <w:r>
+        <w:t xml:space="preserve"> </w:t>
+      </w:r>
+      <w:r>
+        <w:t xml:space="preserve">verified patch step (§7.5), which takes the demonstrated LLM strength (code adaptation) without</w:t>
+      </w:r>
+      <w:r>
+        <w:t xml:space="preserve"> </w:t>
+      </w:r>
+      <w:r>
+        <w:t xml:space="preserve">inheriting its unreliability on cryptographic content.</w:t>
+      </w:r>
+    </w:p>
+    <w:bookmarkEnd w:id="34"/>
+    <w:bookmarkStart w:id="35" w:name="Xf855654c98127d53ec548c743821ee5204023da"/>
     <w:p>
       <w:pPr>
         <w:pStyle w:val="Heading3"/>
@@ -5249,9 +6716,9 @@
         </w:pict>
       </w:r>
     </w:p>
-    <w:bookmarkEnd w:id="33"/>
-    <w:bookmarkEnd w:id="34"/>
-    <w:bookmarkStart w:id="35" w:name="Xc20c787168654b6c2dd213f234737283c9f820a"/>
+    <w:bookmarkEnd w:id="35"/>
+    <w:bookmarkEnd w:id="36"/>
+    <w:bookmarkStart w:id="37" w:name="Xc20c787168654b6c2dd213f234737283c9f820a"/>
     <w:p>
       <w:pPr>
         <w:pStyle w:val="Heading2"/>
@@ -5590,8 +7057,8 @@
         <w:br w:type="page"/>
       </w:r>
     </w:p>
-    <w:bookmarkEnd w:id="35"/>
-    <w:bookmarkStart w:id="44" w:name="Xa8c5dfaaecc5de6007df5544d5bac5ed3383453"/>
+    <w:bookmarkEnd w:id="37"/>
+    <w:bookmarkStart w:id="49" w:name="Xa8c5dfaaecc5de6007df5544d5bac5ed3383453"/>
     <w:p>
       <w:pPr>
         <w:pStyle w:val="Heading2"/>
@@ -5600,7 +7067,7 @@
         <w:t xml:space="preserve">7. Proposed Methodology</w:t>
       </w:r>
     </w:p>
-    <w:bookmarkStart w:id="36" w:name="Xf8b33feb4ed3eebf3836930639ea3cf2e4a3f4c"/>
+    <w:bookmarkStart w:id="38" w:name="Xf8b33feb4ed3eebf3836930639ea3cf2e4a3f4c"/>
     <w:p>
       <w:pPr>
         <w:pStyle w:val="Heading3"/>
@@ -5791,8 +7258,8 @@
         <w:t xml:space="preserve">   enriched CBOM · ranked migration plan · verified pull requests</w:t>
       </w:r>
     </w:p>
-    <w:bookmarkEnd w:id="36"/>
-    <w:bookmarkStart w:id="37" w:name="Xbdf9cf732d98792c81eb56adafeafb30e0ae8b0"/>
+    <w:bookmarkEnd w:id="38"/>
+    <w:bookmarkStart w:id="39" w:name="Xbdf9cf732d98792c81eb56adafeafb30e0ae8b0"/>
     <w:p>
       <w:pPr>
         <w:pStyle w:val="Heading3"/>
@@ -5833,8 +7300,8 @@
         <w:t xml:space="preserve">the CycloneDX 1.6 CBOM object model [P6].</w:t>
       </w:r>
     </w:p>
-    <w:bookmarkEnd w:id="37"/>
-    <w:bookmarkStart w:id="38" w:name="Xe4c8b687f625b5020fecbe1da6184881e79408d"/>
+    <w:bookmarkEnd w:id="39"/>
+    <w:bookmarkStart w:id="40" w:name="Xe4c8b687f625b5020fecbe1da6184881e79408d"/>
     <w:p>
       <w:pPr>
         <w:pStyle w:val="Heading3"/>
@@ -6069,8 +7536,8 @@
         <w:t xml:space="preserve">usable; one that guesses silently is not.</w:t>
       </w:r>
     </w:p>
-    <w:bookmarkEnd w:id="38"/>
-    <w:bookmarkStart w:id="39" w:name="Xcbf05429fd36002bb587fc38ed842b46912f1f5"/>
+    <w:bookmarkEnd w:id="40"/>
+    <w:bookmarkStart w:id="41" w:name="Xcbf05429fd36002bb587fc38ed842b46912f1f5"/>
     <w:p>
       <w:pPr>
         <w:pStyle w:val="Heading3"/>
@@ -6321,8 +7788,8 @@
         <w:t xml:space="preserve">its own operating point.</w:t>
       </w:r>
     </w:p>
-    <w:bookmarkEnd w:id="39"/>
-    <w:bookmarkStart w:id="40" w:name="X91abf32720b2b9b9d9341ee174c8dbd256ac7d5"/>
+    <w:bookmarkEnd w:id="41"/>
+    <w:bookmarkStart w:id="42" w:name="X91abf32720b2b9b9d9341ee174c8dbd256ac7d5"/>
     <w:p>
       <w:pPr>
         <w:pStyle w:val="Heading3"/>
@@ -6487,8 +7954,8 @@
         <w:t xml:space="preserve">against a downgrade attempt.</w:t>
       </w:r>
     </w:p>
-    <w:bookmarkEnd w:id="40"/>
-    <w:bookmarkStart w:id="41" w:name="Xf8472a0e89a97a899315238af53360f61b094c2"/>
+    <w:bookmarkEnd w:id="42"/>
+    <w:bookmarkStart w:id="43" w:name="Xf8472a0e89a97a899315238af53360f61b094c2"/>
     <w:p>
       <w:pPr>
         <w:pStyle w:val="Heading3"/>
@@ -6792,8 +8259,8 @@
         <w:t xml:space="preserve">is O6 and answers the question no prior paper can.</w:t>
       </w:r>
     </w:p>
-    <w:bookmarkEnd w:id="41"/>
-    <w:bookmarkStart w:id="42" w:name="Xda3952b940a6984c806c24c78d45036a4c9d210"/>
+    <w:bookmarkEnd w:id="43"/>
+    <w:bookmarkStart w:id="44" w:name="Xda3952b940a6984c806c24c78d45036a4c9d210"/>
     <w:p>
       <w:pPr>
         <w:pStyle w:val="Heading3"/>
@@ -6884,8 +8351,8 @@
         <w:t xml:space="preserve">construction and patch verification harness. Each part is independently reportable if another slips.</w:t>
       </w:r>
     </w:p>
-    <w:bookmarkEnd w:id="42"/>
-    <w:bookmarkStart w:id="43" w:name="X394dabf7f60e53f82241101402dc196a2b0050d"/>
+    <w:bookmarkEnd w:id="44"/>
+    <w:bookmarkStart w:id="45" w:name="X394dabf7f60e53f82241101402dc196a2b0050d"/>
     <w:p>
       <w:pPr>
         <w:pStyle w:val="Heading3"/>
@@ -7144,36 +8611,260 @@
         <w:t xml:space="preserve">strengthening.</w:t>
       </w:r>
     </w:p>
-    <w:p>
-      <w:r>
-        <w:pict>
-          <v:rect style="width:0;height:1.5pt" o:hralign="center" o:hrstd="t" o:hr="t"/>
-        </w:pict>
-      </w:r>
-    </w:p>
-    <w:p>
-      <w:r>
-        <w:br w:type="page"/>
-      </w:r>
-    </w:p>
-    <w:bookmarkEnd w:id="43"/>
-    <w:bookmarkEnd w:id="44"/>
-    <w:bookmarkStart w:id="49" w:name="Xcff3a53b383d5a734ed4ada1d60e359b625f2a9"/>
-    <w:p>
-      <w:pPr>
-        <w:pStyle w:val="Heading2"/>
-      </w:pPr>
-      <w:r>
-        <w:t xml:space="preserve">8. SWOT Analysis</w:t>
-      </w:r>
-    </w:p>
-    <w:bookmarkStart w:id="45" w:name="strengths"/>
+    <w:bookmarkEnd w:id="45"/>
+    <w:bookmarkStart w:id="46" w:name="X0c726ac9c4a92f068d2b2b6907fcdffa7f1384e"/>
     <w:p>
       <w:pPr>
         <w:pStyle w:val="Heading3"/>
       </w:pPr>
       <w:r>
-        <w:t xml:space="preserve">Strengths</w:t>
+        <w:t xml:space="preserve">7.9 Metric definitions</w:t>
+      </w:r>
+    </w:p>
+    <w:p>
+      <w:pPr>
+        <w:pStyle w:val="FirstParagraph"/>
+      </w:pPr>
+      <w:r>
+        <w:t xml:space="preserve">Stated precisely, because the ranking metrics are the ones no prior paper in this area reports and are</w:t>
+      </w:r>
+      <w:r>
+        <w:t xml:space="preserve"> </w:t>
+      </w:r>
+      <w:r>
+        <w:t xml:space="preserve">therefore the ones a reviewer will scrutinise.</w:t>
+      </w:r>
+    </w:p>
+    <w:p>
+      <w:pPr>
+        <w:pStyle w:val="BodyText"/>
+      </w:pPr>
+      <w:r>
+        <w:rPr>
+          <w:bCs/>
+          <w:b/>
+        </w:rPr>
+        <w:t xml:space="preserve">Discovery accuracy.</w:t>
+      </w:r>
+      <w:r>
+        <w:t xml:space="preserve"> </w:t>
+      </w:r>
+      <w:r>
+        <w:t xml:space="preserve">Standard precision, recall and F1 over ground-truth cryptographic assets, matched</w:t>
+      </w:r>
+      <w:r>
+        <w:t xml:space="preserve"> </w:t>
+      </w:r>
+      <w:r>
+        <w:t xml:space="preserve">by (file, line, algorithm) triple. Reported per language and per asset category, so our numbers are</w:t>
+      </w:r>
+      <w:r>
+        <w:t xml:space="preserve"> </w:t>
+      </w:r>
+      <w:r>
+        <w:t xml:space="preserve">directly comparable to the per-category breakdown in [P1].</w:t>
+      </w:r>
+    </w:p>
+    <w:p>
+      <w:pPr>
+        <w:pStyle w:val="BodyText"/>
+      </w:pPr>
+      <w:r>
+        <w:rPr>
+          <w:bCs/>
+          <w:b/>
+        </w:rPr>
+        <w:t xml:space="preserve">Actionable-finding precision.</w:t>
+      </w:r>
+      <w:r>
+        <w:t xml:space="preserve"> </w:t>
+      </w:r>
+      <w:r>
+        <w:t xml:space="preserve">Of findings the tool presents as requiring action, the fraction an</w:t>
+      </w:r>
+      <w:r>
+        <w:t xml:space="preserve"> </w:t>
+      </w:r>
+      <w:r>
+        <w:t xml:space="preserve">expert annotator agrees require action. This is the metric on which [P1] reports ≈ 0.3, and matching its</w:t>
+      </w:r>
+      <w:r>
+        <w:t xml:space="preserve"> </w:t>
+      </w:r>
+      <w:r>
+        <w:t xml:space="preserve">definition exactly is required for the comparison to be meaningful.</w:t>
+      </w:r>
+    </w:p>
+    <w:p>
+      <w:pPr>
+        <w:pStyle w:val="BodyText"/>
+      </w:pPr>
+      <w:r>
+        <w:rPr>
+          <w:bCs/>
+          <w:b/>
+        </w:rPr>
+        <w:t xml:space="preserve">Ranking quality.</w:t>
+      </w:r>
+      <w:r>
+        <w:t xml:space="preserve"> </w:t>
+      </w:r>
+      <w:r>
+        <w:t xml:space="preserve">With expert relevance grades</w:t>
+      </w:r>
+      <w:r>
+        <w:t xml:space="preserve"> </w:t>
+      </w:r>
+      <w:r>
+        <w:rPr>
+          <w:iCs/>
+          <w:i/>
+        </w:rPr>
+        <w:t xml:space="preserve">relᵢ</w:t>
+      </w:r>
+      <w:r>
+        <w:t xml:space="preserve"> </w:t>
+      </w:r>
+      <w:r>
+        <w:t xml:space="preserve">over the top-</w:t>
+      </w:r>
+      <w:r>
+        <w:rPr>
+          <w:iCs/>
+          <w:i/>
+        </w:rPr>
+        <w:t xml:space="preserve">k</w:t>
+      </w:r>
+      <w:r>
+        <w:t xml:space="preserve"> </w:t>
+      </w:r>
+      <w:r>
+        <w:t xml:space="preserve">findings,</w:t>
+      </w:r>
+    </w:p>
+    <w:p>
+      <w:pPr>
+        <w:pStyle w:val="SourceCode"/>
+      </w:pPr>
+      <w:r>
+        <w:rPr>
+          <w:rStyle w:val="VerbatimChar"/>
+        </w:rPr>
+        <w:t xml:space="preserve">DCG@k = Σᵢ₌₁..k  relᵢ / log₂(i + 1)          nDCG@k = DCG@k / IDCG@k</w:t>
+      </w:r>
+    </w:p>
+    <w:p>
+      <w:pPr>
+        <w:pStyle w:val="FirstParagraph"/>
+      </w:pPr>
+      <w:r>
+        <w:t xml:space="preserve">reported at k = 10 and k = 20. Complemented by Kendall's τ and Spearman's ρ against the full expert</w:t>
+      </w:r>
+      <w:r>
+        <w:t xml:space="preserve"> </w:t>
+      </w:r>
+      <w:r>
+        <w:t xml:space="preserve">ordering, since nDCG rewards getting the head of the list right while τ measures agreement throughout —</w:t>
+      </w:r>
+      <w:r>
+        <w:t xml:space="preserve"> </w:t>
+      </w:r>
+      <w:r>
+        <w:t xml:space="preserve">and an operator works down the list, so both matter.</w:t>
+      </w:r>
+    </w:p>
+    <w:p>
+      <w:pPr>
+        <w:pStyle w:val="BodyText"/>
+      </w:pPr>
+      <w:r>
+        <w:rPr>
+          <w:bCs/>
+          <w:b/>
+        </w:rPr>
+        <w:t xml:space="preserve">Retention inference.</w:t>
+      </w:r>
+      <w:r>
+        <w:t xml:space="preserve"> </w:t>
+      </w:r>
+      <w:r>
+        <w:t xml:space="preserve">Coverage (fraction of persistence sinks for which a retention value was</w:t>
+      </w:r>
+      <w:r>
+        <w:t xml:space="preserve"> </w:t>
+      </w:r>
+      <w:r>
+        <w:t xml:space="preserve">resolved) reported separately from accuracy (fraction of resolved values within one retention class of</w:t>
+      </w:r>
+      <w:r>
+        <w:t xml:space="preserve"> </w:t>
+      </w:r>
+      <w:r>
+        <w:t xml:space="preserve">the annotated truth). Separating them is deliberate: a tool that resolves 40% of sinks accurately is</w:t>
+      </w:r>
+      <w:r>
+        <w:t xml:space="preserve"> </w:t>
+      </w:r>
+      <w:r>
+        <w:t xml:space="preserve">more useful than one that resolves 90% badly, and a single blended number would hide the difference.</w:t>
+      </w:r>
+    </w:p>
+    <w:p>
+      <w:pPr>
+        <w:pStyle w:val="BodyText"/>
+      </w:pPr>
+      <w:r>
+        <w:rPr>
+          <w:bCs/>
+          <w:b/>
+        </w:rPr>
+        <w:t xml:space="preserve">Patch correctness.</w:t>
+      </w:r>
+      <w:r>
+        <w:t xml:space="preserve"> </w:t>
+      </w:r>
+      <w:r>
+        <w:t xml:space="preserve">Fraction of proposed patches passing all three verification gates (§7.5),</w:t>
+      </w:r>
+      <w:r>
+        <w:t xml:space="preserve"> </w:t>
+      </w:r>
+      <w:r>
+        <w:t xml:space="preserve">reported per migration class, with failures categorised by cause.</w:t>
+      </w:r>
+    </w:p>
+    <w:p>
+      <w:pPr>
+        <w:pStyle w:val="BodyText"/>
+      </w:pPr>
+      <w:r>
+        <w:rPr>
+          <w:bCs/>
+          <w:b/>
+        </w:rPr>
+        <w:t xml:space="preserve">Annotation reliability.</w:t>
+      </w:r>
+      <w:r>
+        <w:t xml:space="preserve"> </w:t>
+      </w:r>
+      <w:r>
+        <w:t xml:space="preserve">Krippendorff's α for the asset labels and for the priority orderings, so the</w:t>
+      </w:r>
+      <w:r>
+        <w:t xml:space="preserve"> </w:t>
+      </w:r>
+      <w:r>
+        <w:t xml:space="preserve">subjectivity of the ranking target is quantified rather than assumed away.</w:t>
+      </w:r>
+    </w:p>
+    <w:bookmarkEnd w:id="46"/>
+    <w:bookmarkStart w:id="47" w:name="Xdde6db490aaf55f16f5209876283d5bcd2c78fb"/>
+    <w:p>
+      <w:pPr>
+        <w:pStyle w:val="Heading3"/>
+      </w:pPr>
+      <w:r>
+        <w:t xml:space="preserve">7.10 Risk register</w:t>
       </w:r>
     </w:p>
     <w:tbl>
@@ -7202,18 +8893,40 @@
               <w:jc w:val="left"/>
             </w:pPr>
             <w:r>
-              <w:t xml:space="preserve">Strength</w:t>
-            </w:r>
-          </w:p>
-        </w:tc>
-        <w:tc>
-          <w:p>
-            <w:pPr>
-              <w:pStyle w:val="Compact"/>
-              <w:jc w:val="left"/>
-            </w:pPr>
-            <w:r>
-              <w:t xml:space="preserve">Evidence</w:t>
+              <w:t xml:space="preserve">Risk</w:t>
+            </w:r>
+          </w:p>
+        </w:tc>
+        <w:tc>
+          <w:p>
+            <w:pPr>
+              <w:pStyle w:val="Compact"/>
+              <w:jc w:val="left"/>
+            </w:pPr>
+            <w:r>
+              <w:t xml:space="preserve">Trigger / early indicator</w:t>
+            </w:r>
+          </w:p>
+        </w:tc>
+        <w:tc>
+          <w:p>
+            <w:pPr>
+              <w:pStyle w:val="Compact"/>
+              <w:jc w:val="left"/>
+            </w:pPr>
+            <w:r>
+              <w:t xml:space="preserve">Response</w:t>
+            </w:r>
+          </w:p>
+        </w:tc>
+        <w:tc>
+          <w:p>
+            <w:pPr>
+              <w:pStyle w:val="Compact"/>
+              <w:jc w:val="left"/>
+            </w:pPr>
+            <w:r>
+              <w:t xml:space="preserve">Checkpoint</w:t>
             </w:r>
           </w:p>
         </w:tc>
@@ -7226,29 +8939,64 @@
               <w:jc w:val="left"/>
             </w:pPr>
             <w:r>
-              <w:t xml:space="preserve">S1</w:t>
-            </w:r>
-          </w:p>
-        </w:tc>
-        <w:tc>
-          <w:p>
-            <w:pPr>
-              <w:pStyle w:val="Compact"/>
-              <w:jc w:val="left"/>
-            </w:pPr>
-            <w:r>
-              <w:t xml:space="preserve">Demand is regulator-mandated with a fixed date, not speculative.</w:t>
-            </w:r>
-          </w:p>
-        </w:tc>
-        <w:tc>
-          <w:p>
-            <w:pPr>
-              <w:pStyle w:val="Compact"/>
-              <w:jc w:val="left"/>
-            </w:pPr>
-            <w:r>
-              <w:t xml:space="preserve">RBI Q-SAFE; national CII deadline 2027–2029; SEBI CSCRF; US EO 14412</w:t>
+              <w:t xml:space="preserve">RR1</w:t>
+            </w:r>
+          </w:p>
+        </w:tc>
+        <w:tc>
+          <w:p>
+            <w:pPr>
+              <w:pStyle w:val="Compact"/>
+              <w:jc w:val="left"/>
+            </w:pPr>
+            <w:r>
+              <w:t xml:space="preserve">Dataflow coverage too low to support scoring</w:t>
+            </w:r>
+          </w:p>
+        </w:tc>
+        <w:tc>
+          <w:p>
+            <w:pPr>
+              <w:pStyle w:val="Compact"/>
+              <w:jc w:val="left"/>
+            </w:pPr>
+            <w:r>
+              <w:t xml:space="preserve">&lt; 40% of call sites bound on the first three repositories</w:t>
+            </w:r>
+          </w:p>
+        </w:tc>
+        <w:tc>
+          <w:p>
+            <w:pPr>
+              <w:pStyle w:val="Compact"/>
+              <w:jc w:val="left"/>
+            </w:pPr>
+            <w:r>
+              <w:t xml:space="preserve">Fall back to analyst-supplied retention per</w:t>
+            </w:r>
+            <w:r>
+              <w:t xml:space="preserve"> </w:t>
+            </w:r>
+            <w:r>
+              <w:rPr>
+                <w:iCs/>
+                <w:i/>
+              </w:rPr>
+              <w:t xml:space="preserve">data class</w:t>
+            </w:r>
+            <w:r>
+              <w:t xml:space="preserve">, propagated through the dataflow graph — automates the propagation, drops the inference. N1–N3 survive.</w:t>
+            </w:r>
+          </w:p>
+        </w:tc>
+        <w:tc>
+          <w:p>
+            <w:pPr>
+              <w:pStyle w:val="Compact"/>
+              <w:jc w:val="left"/>
+            </w:pPr>
+            <w:r>
+              <w:t xml:space="preserve">Month 5</w:t>
             </w:r>
           </w:p>
         </w:tc>
@@ -7261,29 +9009,67 @@
               <w:jc w:val="left"/>
             </w:pPr>
             <w:r>
-              <w:t xml:space="preserve">S2</w:t>
-            </w:r>
-          </w:p>
-        </w:tc>
-        <w:tc>
-          <w:p>
-            <w:pPr>
-              <w:pStyle w:val="Compact"/>
-              <w:jc w:val="left"/>
-            </w:pPr>
-            <w:r>
-              <w:t xml:space="preserve">The gap is independently confirmed as future work by three separate 2026 papers.</w:t>
-            </w:r>
-          </w:p>
-        </w:tc>
-        <w:tc>
-          <w:p>
-            <w:pPr>
-              <w:pStyle w:val="Compact"/>
-              <w:jc w:val="left"/>
-            </w:pPr>
-            <w:r>
-              <w:t xml:space="preserve">[P1] admits manual triage; [P4] names the missing pillars; [P5] admits no predictive validation</w:t>
+              <w:t xml:space="preserve">RR2</w:t>
+            </w:r>
+          </w:p>
+        </w:tc>
+        <w:tc>
+          <w:p>
+            <w:pPr>
+              <w:pStyle w:val="Compact"/>
+              <w:jc w:val="left"/>
+            </w:pPr>
+            <w:r>
+              <w:t xml:space="preserve">Retention evidence absent from real repositories</w:t>
+            </w:r>
+          </w:p>
+        </w:tc>
+        <w:tc>
+          <w:p>
+            <w:pPr>
+              <w:pStyle w:val="Compact"/>
+              <w:jc w:val="left"/>
+            </w:pPr>
+            <w:r>
+              <w:t xml:space="preserve">Fewer than half of persistence sinks have any machine-readable retention signal</w:t>
+            </w:r>
+          </w:p>
+        </w:tc>
+        <w:tc>
+          <w:p>
+            <w:pPr>
+              <w:pStyle w:val="Compact"/>
+              <w:jc w:val="left"/>
+            </w:pPr>
+            <w:r>
+              <w:t xml:space="preserve">Extend evidence sources to code comments and commit messages via an LLM extractor, reported separately as</w:t>
+            </w:r>
+            <w:r>
+              <w:t xml:space="preserve"> </w:t>
+            </w:r>
+            <w:r>
+              <w:rPr>
+                <w:iCs/>
+                <w:i/>
+              </w:rPr>
+              <w:t xml:space="preserve">inferred</w:t>
+            </w:r>
+            <w:r>
+              <w:t xml:space="preserve"> </w:t>
+            </w:r>
+            <w:r>
+              <w:t xml:space="preserve">provenance</w:t>
+            </w:r>
+          </w:p>
+        </w:tc>
+        <w:tc>
+          <w:p>
+            <w:pPr>
+              <w:pStyle w:val="Compact"/>
+              <w:jc w:val="left"/>
+            </w:pPr>
+            <w:r>
+              <w:t xml:space="preserve">Month 5</w:t>
             </w:r>
           </w:p>
         </w:tc>
@@ -7296,29 +9082,51 @@
               <w:jc w:val="left"/>
             </w:pPr>
             <w:r>
-              <w:t xml:space="preserve">S3</w:t>
-            </w:r>
-          </w:p>
-        </w:tc>
-        <w:tc>
-          <w:p>
-            <w:pPr>
-              <w:pStyle w:val="Compact"/>
-              <w:jc w:val="left"/>
-            </w:pPr>
-            <w:r>
-              <w:t xml:space="preserve">Published numbers exist to be measured against — no need to invent a success criterion.</w:t>
-            </w:r>
-          </w:p>
-        </w:tc>
-        <w:tc>
-          <w:p>
-            <w:pPr>
-              <w:pStyle w:val="Compact"/>
-              <w:jc w:val="left"/>
-            </w:pPr>
-            <w:r>
-              <w:t xml:space="preserve">0.75 F1, ≈0.3 actionable precision, 0.66 CBOMkit, 92.5% patch correctness</w:t>
+              <w:t xml:space="preserve">RR3</w:t>
+            </w:r>
+          </w:p>
+        </w:tc>
+        <w:tc>
+          <w:p>
+            <w:pPr>
+              <w:pStyle w:val="Compact"/>
+              <w:jc w:val="left"/>
+            </w:pPr>
+            <w:r>
+              <w:t xml:space="preserve">Expert annotator unavailable</w:t>
+            </w:r>
+          </w:p>
+        </w:tc>
+        <w:tc>
+          <w:p>
+            <w:pPr>
+              <w:pStyle w:val="Compact"/>
+              <w:jc w:val="left"/>
+            </w:pPr>
+            <w:r>
+              <w:t xml:space="preserve">No confirmed labeller by month 4</w:t>
+            </w:r>
+          </w:p>
+        </w:tc>
+        <w:tc>
+          <w:p>
+            <w:pPr>
+              <w:pStyle w:val="Compact"/>
+              <w:jc w:val="left"/>
+            </w:pPr>
+            <w:r>
+              <w:t xml:space="preserve">Two-team-member rubric-driven ordering plus guide adjudication; report α and state the weaker authority</w:t>
+            </w:r>
+          </w:p>
+        </w:tc>
+        <w:tc>
+          <w:p>
+            <w:pPr>
+              <w:pStyle w:val="Compact"/>
+              <w:jc w:val="left"/>
+            </w:pPr>
+            <w:r>
+              <w:t xml:space="preserve">Month 4</w:t>
             </w:r>
           </w:p>
         </w:tc>
@@ -7331,29 +9139,51 @@
               <w:jc w:val="left"/>
             </w:pPr>
             <w:r>
-              <w:t xml:space="preserve">S4</w:t>
-            </w:r>
-          </w:p>
-        </w:tc>
-        <w:tc>
-          <w:p>
-            <w:pPr>
-              <w:pStyle w:val="Compact"/>
-              <w:jc w:val="left"/>
-            </w:pPr>
-            <w:r>
-              <w:t xml:space="preserve">Zero hardware cost, zero data collection, no GPU, no vendor dependency.</w:t>
-            </w:r>
-          </w:p>
-        </w:tc>
-        <w:tc>
-          <w:p>
-            <w:pPr>
-              <w:pStyle w:val="Compact"/>
-              <w:jc w:val="left"/>
-            </w:pPr>
-            <w:r>
-              <w:t xml:space="preserve">Pure static analysis</w:t>
+              <w:t xml:space="preserve">RR4</w:t>
+            </w:r>
+          </w:p>
+        </w:tc>
+        <w:tc>
+          <w:p>
+            <w:pPr>
+              <w:pStyle w:val="Compact"/>
+              <w:jc w:val="left"/>
+            </w:pPr>
+            <w:r>
+              <w:t xml:space="preserve">Baseline replication fails (cannot reproduce [P1]/CBOMkit numbers)</w:t>
+            </w:r>
+          </w:p>
+        </w:tc>
+        <w:tc>
+          <w:p>
+            <w:pPr>
+              <w:pStyle w:val="Compact"/>
+              <w:jc w:val="left"/>
+            </w:pPr>
+            <w:r>
+              <w:t xml:space="preserve">Month 4 replication off by &gt; 10 points</w:t>
+            </w:r>
+          </w:p>
+        </w:tc>
+        <w:tc>
+          <w:p>
+            <w:pPr>
+              <w:pStyle w:val="Compact"/>
+              <w:jc w:val="left"/>
+            </w:pPr>
+            <w:r>
+              <w:t xml:space="preserve">Report on our benchmark only, with the discrepancy documented; do not claim comparability we cannot support</w:t>
+            </w:r>
+          </w:p>
+        </w:tc>
+        <w:tc>
+          <w:p>
+            <w:pPr>
+              <w:pStyle w:val="Compact"/>
+              <w:jc w:val="left"/>
+            </w:pPr>
+            <w:r>
+              <w:t xml:space="preserve">Month 4</w:t>
             </w:r>
           </w:p>
         </w:tc>
@@ -7366,29 +9196,67 @@
               <w:jc w:val="left"/>
             </w:pPr>
             <w:r>
-              <w:t xml:space="preserve">S5</w:t>
-            </w:r>
-          </w:p>
-        </w:tc>
-        <w:tc>
-          <w:p>
-            <w:pPr>
-              <w:pStyle w:val="Compact"/>
-              <w:jc w:val="left"/>
-            </w:pPr>
-            <w:r>
-              <w:t xml:space="preserve">Core technique is proven tractable at scale since 2019.</w:t>
-            </w:r>
-          </w:p>
-        </w:tc>
-        <w:tc>
-          <w:p>
-            <w:pPr>
-              <w:pStyle w:val="Compact"/>
-              <w:jc w:val="left"/>
-            </w:pPr>
-            <w:r>
-              <w:t xml:space="preserve">CryptoGuard [P13]</w:t>
+              <w:t xml:space="preserve">RR5</w:t>
+            </w:r>
+          </w:p>
+        </w:tc>
+        <w:tc>
+          <w:p>
+            <w:pPr>
+              <w:pStyle w:val="Compact"/>
+              <w:jc w:val="left"/>
+            </w:pPr>
+            <w:r>
+              <w:t xml:space="preserve">Patch synthesis unreliable</w:t>
+            </w:r>
+          </w:p>
+        </w:tc>
+        <w:tc>
+          <w:p>
+            <w:pPr>
+              <w:pStyle w:val="Compact"/>
+              <w:jc w:val="left"/>
+            </w:pPr>
+            <w:r>
+              <w:t xml:space="preserve">&lt; 50% passing the verification gate</w:t>
+            </w:r>
+          </w:p>
+        </w:tc>
+        <w:tc>
+          <w:p>
+            <w:pPr>
+              <w:pStyle w:val="Compact"/>
+              <w:jc w:val="left"/>
+            </w:pPr>
+            <w:r>
+              <w:t xml:space="preserve">Ship as a</w:t>
+            </w:r>
+            <w:r>
+              <w:t xml:space="preserve"> </w:t>
+            </w:r>
+            <w:r>
+              <w:rPr>
+                <w:iCs/>
+                <w:i/>
+              </w:rPr>
+              <w:t xml:space="preserve">diagnostic-only</w:t>
+            </w:r>
+            <w:r>
+              <w:t xml:space="preserve"> </w:t>
+            </w:r>
+            <w:r>
+              <w:t xml:space="preserve">tool; N1–N3 stand alone and the patch stage becomes future work</w:t>
+            </w:r>
+          </w:p>
+        </w:tc>
+        <w:tc>
+          <w:p>
+            <w:pPr>
+              <w:pStyle w:val="Compact"/>
+              <w:jc w:val="left"/>
+            </w:pPr>
+            <w:r>
+              <w:t xml:space="preserve">Month 9</w:t>
             </w:r>
           </w:p>
         </w:tc>
@@ -7401,29 +9269,51 @@
               <w:jc w:val="left"/>
             </w:pPr>
             <w:r>
-              <w:t xml:space="preserve">S6</w:t>
-            </w:r>
-          </w:p>
-        </w:tc>
-        <w:tc>
-          <w:p>
-            <w:pPr>
-              <w:pStyle w:val="Compact"/>
-              <w:jc w:val="left"/>
-            </w:pPr>
-            <w:r>
-              <w:t xml:space="preserve">Clean three-way decomposition; every layer is independently publishable.</w:t>
-            </w:r>
-          </w:p>
-        </w:tc>
-        <w:tc>
-          <w:p>
-            <w:pPr>
-              <w:pStyle w:val="Compact"/>
-              <w:jc w:val="left"/>
-            </w:pPr>
-            <w:r>
-              <w:t xml:space="preserve">§7.7</w:t>
+              <w:t xml:space="preserve">RR6</w:t>
+            </w:r>
+          </w:p>
+        </w:tc>
+        <w:tc>
+          <w:p>
+            <w:pPr>
+              <w:pStyle w:val="Compact"/>
+              <w:jc w:val="left"/>
+            </w:pPr>
+            <w:r>
+              <w:t xml:space="preserve">Competing product release</w:t>
+            </w:r>
+          </w:p>
+        </w:tc>
+        <w:tc>
+          <w:p>
+            <w:pPr>
+              <w:pStyle w:val="Compact"/>
+              <w:jc w:val="left"/>
+            </w:pPr>
+            <w:r>
+              <w:t xml:space="preserve">Vendor announcement of dataflow prioritisation</w:t>
+            </w:r>
+          </w:p>
+        </w:tc>
+        <w:tc>
+          <w:p>
+            <w:pPr>
+              <w:pStyle w:val="Compact"/>
+              <w:jc w:val="left"/>
+            </w:pPr>
+            <w:r>
+              <w:t xml:space="preserve">File provisional immediately; pivot the paper's framing to the open, evaluated, benchmarked comparison — which a product release does not provide</w:t>
+            </w:r>
+          </w:p>
+        </w:tc>
+        <w:tc>
+          <w:p>
+            <w:pPr>
+              <w:pStyle w:val="Compact"/>
+              <w:jc w:val="left"/>
+            </w:pPr>
+            <w:r>
+              <w:t xml:space="preserve">Continuous</w:t>
             </w:r>
           </w:p>
         </w:tc>
@@ -7436,77 +9326,189 @@
               <w:jc w:val="left"/>
             </w:pPr>
             <w:r>
-              <w:t xml:space="preserve">S7</w:t>
-            </w:r>
-          </w:p>
-        </w:tc>
-        <w:tc>
-          <w:p>
-            <w:pPr>
-              <w:pStyle w:val="Compact"/>
-              <w:jc w:val="left"/>
-            </w:pPr>
-            <w:r>
-              <w:t xml:space="preserve">Genuine patent position with a measurable technical effect.</w:t>
-            </w:r>
-          </w:p>
-        </w:tc>
-        <w:tc>
-          <w:p>
-            <w:pPr>
-              <w:pStyle w:val="Compact"/>
-              <w:jc w:val="left"/>
-            </w:pPr>
-            <w:r>
-              <w:t xml:space="preserve">§6, CRI Guidelines 2025</w:t>
-            </w:r>
-          </w:p>
-        </w:tc>
-      </w:tr>
-      <w:tr>
-        <w:tc>
-          <w:p>
-            <w:pPr>
-              <w:pStyle w:val="Compact"/>
-              <w:jc w:val="left"/>
-            </w:pPr>
-            <w:r>
-              <w:t xml:space="preserve">S8</w:t>
-            </w:r>
-          </w:p>
-        </w:tc>
-        <w:tc>
-          <w:p>
-            <w:pPr>
-              <w:pStyle w:val="Compact"/>
-              <w:jc w:val="left"/>
-            </w:pPr>
-            <w:r>
-              <w:t xml:space="preserve">Demonstration is concrete and short: point the tool at a real repository, get a ranked plan and an opened pull request.</w:t>
-            </w:r>
-          </w:p>
-        </w:tc>
-        <w:tc>
-          <w:p>
-            <w:pPr>
-              <w:pStyle w:val="Compact"/>
-              <w:jc w:val="left"/>
-            </w:pPr>
-            <w:r>
-              <w:t xml:space="preserve">—</w:t>
+              <w:t xml:space="preserve">RR7</w:t>
+            </w:r>
+          </w:p>
+        </w:tc>
+        <w:tc>
+          <w:p>
+            <w:pPr>
+              <w:pStyle w:val="Compact"/>
+              <w:jc w:val="left"/>
+            </w:pPr>
+            <w:r>
+              <w:t xml:space="preserve">Schema churn</w:t>
+            </w:r>
+          </w:p>
+        </w:tc>
+        <w:tc>
+          <w:p>
+            <w:pPr>
+              <w:pStyle w:val="Compact"/>
+              <w:jc w:val="left"/>
+            </w:pPr>
+            <w:r>
+              <w:t xml:space="preserve">CISA/NIST minimum-elements publication</w:t>
+            </w:r>
+          </w:p>
+        </w:tc>
+        <w:tc>
+          <w:p>
+            <w:pPr>
+              <w:pStyle w:val="Compact"/>
+              <w:jc w:val="left"/>
+            </w:pPr>
+            <w:r>
+              <w:t xml:space="preserve">Adapter layer already isolates emission; re-map fields only</w:t>
+            </w:r>
+          </w:p>
+        </w:tc>
+        <w:tc>
+          <w:p>
+            <w:pPr>
+              <w:pStyle w:val="Compact"/>
+              <w:jc w:val="left"/>
+            </w:pPr>
+            <w:r>
+              <w:t xml:space="preserve">Continuous</w:t>
             </w:r>
           </w:p>
         </w:tc>
       </w:tr>
     </w:tbl>
-    <w:bookmarkEnd w:id="45"/>
-    <w:bookmarkStart w:id="46" w:name="weaknesses"/>
+    <w:bookmarkEnd w:id="47"/>
+    <w:bookmarkStart w:id="48" w:name="X52755125c6c8731226dbfe6b18c5301ba076c44"/>
     <w:p>
       <w:pPr>
         <w:pStyle w:val="Heading3"/>
       </w:pPr>
       <w:r>
-        <w:t xml:space="preserve">Weaknesses</w:t>
+        <w:t xml:space="preserve">7.11 Ethics and responsible disclosure</w:t>
+      </w:r>
+    </w:p>
+    <w:p>
+      <w:pPr>
+        <w:pStyle w:val="FirstParagraph"/>
+      </w:pPr>
+      <w:r>
+        <w:t xml:space="preserve">The tool analyses real open-source repositories and produces findings that, in the aggregate, describe</w:t>
+      </w:r>
+      <w:r>
+        <w:t xml:space="preserve"> </w:t>
+      </w:r>
+      <w:r>
+        <w:t xml:space="preserve">exploitable weakness in deployed software. Three commitments follow.</w:t>
+      </w:r>
+      <w:r>
+        <w:t xml:space="preserve"> </w:t>
+      </w:r>
+      <w:r>
+        <w:rPr>
+          <w:bCs/>
+          <w:b/>
+        </w:rPr>
+        <w:t xml:space="preserve">(a)</w:t>
+      </w:r>
+      <w:r>
+        <w:t xml:space="preserve"> </w:t>
+      </w:r>
+      <w:r>
+        <w:t xml:space="preserve">Genuine</w:t>
+      </w:r>
+      <w:r>
+        <w:t xml:space="preserve"> </w:t>
+      </w:r>
+      <w:r>
+        <w:t xml:space="preserve">present-day vulnerabilities discovered incidentally (CVE-linked dependencies, hardcoded keys) are</w:t>
+      </w:r>
+      <w:r>
+        <w:t xml:space="preserve"> </w:t>
+      </w:r>
+      <w:r>
+        <w:t xml:space="preserve">reported privately to maintainers before any publication, on a 90-day disclosure clock.</w:t>
+      </w:r>
+      <w:r>
+        <w:t xml:space="preserve"> </w:t>
+      </w:r>
+      <w:r>
+        <w:rPr>
+          <w:bCs/>
+          <w:b/>
+        </w:rPr>
+        <w:t xml:space="preserve">(b)</w:t>
+      </w:r>
+      <w:r>
+        <w:t xml:space="preserve"> </w:t>
+      </w:r>
+      <w:r>
+        <w:t xml:space="preserve">The</w:t>
+      </w:r>
+      <w:r>
+        <w:t xml:space="preserve"> </w:t>
+      </w:r>
+      <w:r>
+        <w:t xml:space="preserve">published benchmark reports assets and priority orderings at pinned commits, and does not include</w:t>
+      </w:r>
+      <w:r>
+        <w:t xml:space="preserve"> </w:t>
+      </w:r>
+      <w:r>
+        <w:t xml:space="preserve">credentials or exploit paths.</w:t>
+      </w:r>
+      <w:r>
+        <w:t xml:space="preserve"> </w:t>
+      </w:r>
+      <w:r>
+        <w:rPr>
+          <w:bCs/>
+          <w:b/>
+        </w:rPr>
+        <w:t xml:space="preserve">(c)</w:t>
+      </w:r>
+      <w:r>
+        <w:t xml:space="preserve"> </w:t>
+      </w:r>
+      <w:r>
+        <w:t xml:space="preserve">Quantum-vulnerable-but-currently-secure findings — the project's</w:t>
+      </w:r>
+      <w:r>
+        <w:t xml:space="preserve"> </w:t>
+      </w:r>
+      <w:r>
+        <w:t xml:space="preserve">actual subject — are not treated as vulnerabilities requiring embargo, and this distinction is stated</w:t>
+      </w:r>
+      <w:r>
+        <w:t xml:space="preserve"> </w:t>
+      </w:r>
+      <w:r>
+        <w:t xml:space="preserve">explicitly in the artefact so the benchmark is not misread as a list of live weaknesses.</w:t>
+      </w:r>
+    </w:p>
+    <w:p>
+      <w:r>
+        <w:pict>
+          <v:rect style="width:0;height:1.5pt" o:hralign="center" o:hrstd="t" o:hr="t"/>
+        </w:pict>
+      </w:r>
+    </w:p>
+    <w:bookmarkEnd w:id="48"/>
+    <w:bookmarkEnd w:id="49"/>
+    <w:bookmarkStart w:id="54" w:name="Xcff3a53b383d5a734ed4ada1d60e359b625f2a9"/>
+    <w:p>
+      <w:pPr>
+        <w:pStyle w:val="Heading2"/>
+      </w:pPr>
+      <w:r>
+        <w:t xml:space="preserve">8. SWOT Analysis</w:t>
+      </w:r>
+    </w:p>
+    <w:bookmarkStart w:id="50" w:name="strengths"/>
+    <w:p>
+      <w:pPr>
+        <w:pStyle w:val="Heading3"/>
+      </w:pPr>
+      <w:r>
+        <w:t xml:space="preserve">Strengths</w:t>
       </w:r>
     </w:p>
     <w:tbl>
@@ -7535,18 +9537,18 @@
               <w:jc w:val="left"/>
             </w:pPr>
             <w:r>
-              <w:t xml:space="preserve">Weakness</w:t>
-            </w:r>
-          </w:p>
-        </w:tc>
-        <w:tc>
-          <w:p>
-            <w:pPr>
-              <w:pStyle w:val="Compact"/>
-              <w:jc w:val="left"/>
-            </w:pPr>
-            <w:r>
-              <w:t xml:space="preserve">Mitigation</w:t>
+              <w:t xml:space="preserve">Strength</w:t>
+            </w:r>
+          </w:p>
+        </w:tc>
+        <w:tc>
+          <w:p>
+            <w:pPr>
+              <w:pStyle w:val="Compact"/>
+              <w:jc w:val="left"/>
+            </w:pPr>
+            <w:r>
+              <w:t xml:space="preserve">Evidence</w:t>
             </w:r>
           </w:p>
         </w:tc>
@@ -7559,29 +9561,29 @@
               <w:jc w:val="left"/>
             </w:pPr>
             <w:r>
-              <w:t xml:space="preserve">W1</w:t>
-            </w:r>
-          </w:p>
-        </w:tc>
-        <w:tc>
-          <w:p>
-            <w:pPr>
-              <w:pStyle w:val="Compact"/>
-              <w:jc w:val="left"/>
-            </w:pPr>
-            <w:r>
-              <w:t xml:space="preserve">Inter-procedural dataflow in dynamically typed Python is genuinely hard; P1 concedes even literal resolution fails for runtime-computed arguments.</w:t>
-            </w:r>
-          </w:p>
-        </w:tc>
-        <w:tc>
-          <w:p>
-            <w:pPr>
-              <w:pStyle w:val="Compact"/>
-              <w:jc w:val="left"/>
-            </w:pPr>
-            <w:r>
-              <w:t xml:space="preserve">Target 70% coverage, not 100%; explicit "insufficient context" bucket; Java (statically typed, CodeQL-supported) as the primary demonstration language.</w:t>
+              <w:t xml:space="preserve">S1</w:t>
+            </w:r>
+          </w:p>
+        </w:tc>
+        <w:tc>
+          <w:p>
+            <w:pPr>
+              <w:pStyle w:val="Compact"/>
+              <w:jc w:val="left"/>
+            </w:pPr>
+            <w:r>
+              <w:t xml:space="preserve">Demand is regulator-mandated with a fixed date, not speculative.</w:t>
+            </w:r>
+          </w:p>
+        </w:tc>
+        <w:tc>
+          <w:p>
+            <w:pPr>
+              <w:pStyle w:val="Compact"/>
+              <w:jc w:val="left"/>
+            </w:pPr>
+            <w:r>
+              <w:t xml:space="preserve">RBI Q-SAFE; national CII deadline 2027–2029; SEBI CSCRF; US EO 14412</w:t>
             </w:r>
           </w:p>
         </w:tc>
@@ -7594,29 +9596,29 @@
               <w:jc w:val="left"/>
             </w:pPr>
             <w:r>
-              <w:t xml:space="preserve">W2</w:t>
-            </w:r>
-          </w:p>
-        </w:tc>
-        <w:tc>
-          <w:p>
-            <w:pPr>
-              <w:pStyle w:val="Compact"/>
-              <w:jc w:val="left"/>
-            </w:pPr>
-            <w:r>
-              <w:t xml:space="preserve">Retention ground truth requires human annotation; no public dataset exists.</w:t>
-            </w:r>
-          </w:p>
-        </w:tc>
-        <w:tc>
-          <w:p>
-            <w:pPr>
-              <w:pStyle w:val="Compact"/>
-              <w:jc w:val="left"/>
-            </w:pPr>
-            <w:r>
-              <w:t xml:space="preserve">Annotation is scoped to top-20 findings per repository (~300–400 labels), two annotators, agreement reported. Building the benchmark is reframed as contribution O6.</w:t>
+              <w:t xml:space="preserve">S2</w:t>
+            </w:r>
+          </w:p>
+        </w:tc>
+        <w:tc>
+          <w:p>
+            <w:pPr>
+              <w:pStyle w:val="Compact"/>
+              <w:jc w:val="left"/>
+            </w:pPr>
+            <w:r>
+              <w:t xml:space="preserve">The gap is independently confirmed as future work by three separate 2026 papers.</w:t>
+            </w:r>
+          </w:p>
+        </w:tc>
+        <w:tc>
+          <w:p>
+            <w:pPr>
+              <w:pStyle w:val="Compact"/>
+              <w:jc w:val="left"/>
+            </w:pPr>
+            <w:r>
+              <w:t xml:space="preserve">[P1] admits manual triage; [P4] names the missing pillars; [P5] admits no predictive validation</w:t>
             </w:r>
           </w:p>
         </w:tc>
@@ -7629,45 +9631,29 @@
               <w:jc w:val="left"/>
             </w:pPr>
             <w:r>
-              <w:t xml:space="preserve">W3</w:t>
-            </w:r>
-          </w:p>
-        </w:tc>
-        <w:tc>
-          <w:p>
-            <w:pPr>
-              <w:pStyle w:val="Compact"/>
-              <w:jc w:val="left"/>
-            </w:pPr>
-            <w:r>
-              <w:t xml:space="preserve">Expert priority labels are subjective; the ranking target is partly opinion.</w:t>
-            </w:r>
-          </w:p>
-        </w:tc>
-        <w:tc>
-          <w:p>
-            <w:pPr>
-              <w:pStyle w:val="Compact"/>
-              <w:jc w:val="left"/>
-            </w:pPr>
-            <w:r>
-              <w:t xml:space="preserve">Report inter-annotator agreement; use</w:t>
-            </w:r>
-            <w:r>
-              <w:t xml:space="preserve"> </w:t>
-            </w:r>
-            <w:r>
-              <w:rPr>
-                <w:iCs/>
-                <w:i/>
-              </w:rPr>
-              <w:t xml:space="preserve">ordering</w:t>
-            </w:r>
-            <w:r>
-              <w:t xml:space="preserve"> </w:t>
-            </w:r>
-            <w:r>
-              <w:t xml:space="preserve">not absolute scores; hold out repositories; report sensitivity to weights.</w:t>
+              <w:t xml:space="preserve">S3</w:t>
+            </w:r>
+          </w:p>
+        </w:tc>
+        <w:tc>
+          <w:p>
+            <w:pPr>
+              <w:pStyle w:val="Compact"/>
+              <w:jc w:val="left"/>
+            </w:pPr>
+            <w:r>
+              <w:t xml:space="preserve">Published numbers exist to be measured against — no need to invent a success criterion.</w:t>
+            </w:r>
+          </w:p>
+        </w:tc>
+        <w:tc>
+          <w:p>
+            <w:pPr>
+              <w:pStyle w:val="Compact"/>
+              <w:jc w:val="left"/>
+            </w:pPr>
+            <w:r>
+              <w:t xml:space="preserve">0.75 F1, ≈0.3 actionable precision, 0.66 CBOMkit, 92.5% patch correctness</w:t>
             </w:r>
           </w:p>
         </w:tc>
@@ -7680,29 +9666,29 @@
               <w:jc w:val="left"/>
             </w:pPr>
             <w:r>
-              <w:t xml:space="preserve">W4</w:t>
-            </w:r>
-          </w:p>
-        </w:tc>
-        <w:tc>
-          <w:p>
-            <w:pPr>
-              <w:pStyle w:val="Compact"/>
-              <w:jc w:val="left"/>
-            </w:pPr>
-            <w:r>
-              <w:t xml:space="preserve">The team has no prior static-analysis or compiler experience.</w:t>
-            </w:r>
-          </w:p>
-        </w:tc>
-        <w:tc>
-          <w:p>
-            <w:pPr>
-              <w:pStyle w:val="Compact"/>
-              <w:jc w:val="left"/>
-            </w:pPr>
-            <w:r>
-              <w:t xml:space="preserve">Build on CodeQL and Semgrep rather than a bespoke IR; month 3–4 baseline replication acts as an early competence check with a fallback (drop to intra-procedural + configuration-level binding, which still exceeds all baselines).</w:t>
+              <w:t xml:space="preserve">S4</w:t>
+            </w:r>
+          </w:p>
+        </w:tc>
+        <w:tc>
+          <w:p>
+            <w:pPr>
+              <w:pStyle w:val="Compact"/>
+              <w:jc w:val="left"/>
+            </w:pPr>
+            <w:r>
+              <w:t xml:space="preserve">Zero hardware cost, zero data collection, no GPU, no vendor dependency.</w:t>
+            </w:r>
+          </w:p>
+        </w:tc>
+        <w:tc>
+          <w:p>
+            <w:pPr>
+              <w:pStyle w:val="Compact"/>
+              <w:jc w:val="left"/>
+            </w:pPr>
+            <w:r>
+              <w:t xml:space="preserve">Pure static analysis</w:t>
             </w:r>
           </w:p>
         </w:tc>
@@ -7715,29 +9701,29 @@
               <w:jc w:val="left"/>
             </w:pPr>
             <w:r>
-              <w:t xml:space="preserve">W5</w:t>
-            </w:r>
-          </w:p>
-        </w:tc>
-        <w:tc>
-          <w:p>
-            <w:pPr>
-              <w:pStyle w:val="Compact"/>
-              <w:jc w:val="left"/>
-            </w:pPr>
-            <w:r>
-              <w:t xml:space="preserve">Differential testing is unsound — it can miss inequivalence.</w:t>
-            </w:r>
-          </w:p>
-        </w:tc>
-        <w:tc>
-          <w:p>
-            <w:pPr>
-              <w:pStyle w:val="Compact"/>
-              <w:jc w:val="left"/>
-            </w:pPr>
-            <w:r>
-              <w:t xml:space="preserve">Stated as a limitation, not hidden; property tests target the specific classes round-trip testing misses.</w:t>
+              <w:t xml:space="preserve">S5</w:t>
+            </w:r>
+          </w:p>
+        </w:tc>
+        <w:tc>
+          <w:p>
+            <w:pPr>
+              <w:pStyle w:val="Compact"/>
+              <w:jc w:val="left"/>
+            </w:pPr>
+            <w:r>
+              <w:t xml:space="preserve">Core technique is proven tractable at scale since 2019.</w:t>
+            </w:r>
+          </w:p>
+        </w:tc>
+        <w:tc>
+          <w:p>
+            <w:pPr>
+              <w:pStyle w:val="Compact"/>
+              <w:jc w:val="left"/>
+            </w:pPr>
+            <w:r>
+              <w:t xml:space="preserve">CryptoGuard [P13]</w:t>
             </w:r>
           </w:p>
         </w:tc>
@@ -7750,42 +9736,112 @@
               <w:jc w:val="left"/>
             </w:pPr>
             <w:r>
-              <w:t xml:space="preserve">W6</w:t>
-            </w:r>
-          </w:p>
-        </w:tc>
-        <w:tc>
-          <w:p>
-            <w:pPr>
-              <w:pStyle w:val="Compact"/>
-              <w:jc w:val="left"/>
-            </w:pPr>
-            <w:r>
-              <w:t xml:space="preserve">We cannot see into vendored binaries or closed dependencies.</w:t>
-            </w:r>
-          </w:p>
-        </w:tc>
-        <w:tc>
-          <w:p>
-            <w:pPr>
-              <w:pStyle w:val="Compact"/>
-              <w:jc w:val="left"/>
-            </w:pPr>
-            <w:r>
-              <w:t xml:space="preserve">Declared out of scope with the complementary line of work cited [P11].</w:t>
+              <w:t xml:space="preserve">S6</w:t>
+            </w:r>
+          </w:p>
+        </w:tc>
+        <w:tc>
+          <w:p>
+            <w:pPr>
+              <w:pStyle w:val="Compact"/>
+              <w:jc w:val="left"/>
+            </w:pPr>
+            <w:r>
+              <w:t xml:space="preserve">Clean three-way decomposition; every layer is independently publishable.</w:t>
+            </w:r>
+          </w:p>
+        </w:tc>
+        <w:tc>
+          <w:p>
+            <w:pPr>
+              <w:pStyle w:val="Compact"/>
+              <w:jc w:val="left"/>
+            </w:pPr>
+            <w:r>
+              <w:t xml:space="preserve">§7.7</w:t>
+            </w:r>
+          </w:p>
+        </w:tc>
+      </w:tr>
+      <w:tr>
+        <w:tc>
+          <w:p>
+            <w:pPr>
+              <w:pStyle w:val="Compact"/>
+              <w:jc w:val="left"/>
+            </w:pPr>
+            <w:r>
+              <w:t xml:space="preserve">S7</w:t>
+            </w:r>
+          </w:p>
+        </w:tc>
+        <w:tc>
+          <w:p>
+            <w:pPr>
+              <w:pStyle w:val="Compact"/>
+              <w:jc w:val="left"/>
+            </w:pPr>
+            <w:r>
+              <w:t xml:space="preserve">Genuine patent position with a measurable technical effect.</w:t>
+            </w:r>
+          </w:p>
+        </w:tc>
+        <w:tc>
+          <w:p>
+            <w:pPr>
+              <w:pStyle w:val="Compact"/>
+              <w:jc w:val="left"/>
+            </w:pPr>
+            <w:r>
+              <w:t xml:space="preserve">§6, CRI Guidelines 2025</w:t>
+            </w:r>
+          </w:p>
+        </w:tc>
+      </w:tr>
+      <w:tr>
+        <w:tc>
+          <w:p>
+            <w:pPr>
+              <w:pStyle w:val="Compact"/>
+              <w:jc w:val="left"/>
+            </w:pPr>
+            <w:r>
+              <w:t xml:space="preserve">S8</w:t>
+            </w:r>
+          </w:p>
+        </w:tc>
+        <w:tc>
+          <w:p>
+            <w:pPr>
+              <w:pStyle w:val="Compact"/>
+              <w:jc w:val="left"/>
+            </w:pPr>
+            <w:r>
+              <w:t xml:space="preserve">Demonstration is concrete and short: point the tool at a real repository, get a ranked plan and an opened pull request.</w:t>
+            </w:r>
+          </w:p>
+        </w:tc>
+        <w:tc>
+          <w:p>
+            <w:pPr>
+              <w:pStyle w:val="Compact"/>
+              <w:jc w:val="left"/>
+            </w:pPr>
+            <w:r>
+              <w:t xml:space="preserve">—</w:t>
             </w:r>
           </w:p>
         </w:tc>
       </w:tr>
     </w:tbl>
-    <w:bookmarkEnd w:id="46"/>
-    <w:bookmarkStart w:id="47" w:name="opportunities"/>
+    <w:bookmarkEnd w:id="50"/>
+    <w:bookmarkStart w:id="51" w:name="weaknesses"/>
     <w:p>
       <w:pPr>
         <w:pStyle w:val="Heading3"/>
       </w:pPr>
       <w:r>
-        <w:t xml:space="preserve">Opportunities</w:t>
+        <w:t xml:space="preserve">Weaknesses</w:t>
       </w:r>
     </w:p>
     <w:tbl>
@@ -7814,7 +9870,18 @@
               <w:jc w:val="left"/>
             </w:pPr>
             <w:r>
-              <w:t xml:space="preserve">Opportunity</w:t>
+              <w:t xml:space="preserve">Weakness</w:t>
+            </w:r>
+          </w:p>
+        </w:tc>
+        <w:tc>
+          <w:p>
+            <w:pPr>
+              <w:pStyle w:val="Compact"/>
+              <w:jc w:val="left"/>
+            </w:pPr>
+            <w:r>
+              <w:t xml:space="preserve">Mitigation</w:t>
             </w:r>
           </w:p>
         </w:tc>
@@ -7827,18 +9894,29 @@
               <w:jc w:val="left"/>
             </w:pPr>
             <w:r>
-              <w:t xml:space="preserve">O1</w:t>
-            </w:r>
-          </w:p>
-        </w:tc>
-        <w:tc>
-          <w:p>
-            <w:pPr>
-              <w:pStyle w:val="Compact"/>
-              <w:jc w:val="left"/>
-            </w:pPr>
-            <w:r>
-              <w:t xml:space="preserve">CISA/NIST CBOM minimum elements (due under EO 14412) will define a schema target; conforming early positions the tool as reference-compatible.</w:t>
+              <w:t xml:space="preserve">W1</w:t>
+            </w:r>
+          </w:p>
+        </w:tc>
+        <w:tc>
+          <w:p>
+            <w:pPr>
+              <w:pStyle w:val="Compact"/>
+              <w:jc w:val="left"/>
+            </w:pPr>
+            <w:r>
+              <w:t xml:space="preserve">Inter-procedural dataflow in dynamically typed Python is genuinely hard; P1 concedes even literal resolution fails for runtime-computed arguments.</w:t>
+            </w:r>
+          </w:p>
+        </w:tc>
+        <w:tc>
+          <w:p>
+            <w:pPr>
+              <w:pStyle w:val="Compact"/>
+              <w:jc w:val="left"/>
+            </w:pPr>
+            <w:r>
+              <w:t xml:space="preserve">Target 70% coverage, not 100%; explicit "insufficient context" bucket; Java (statically typed, CodeQL-supported) as the primary demonstration language.</w:t>
             </w:r>
           </w:p>
         </w:tc>
@@ -7851,18 +9929,29 @@
               <w:jc w:val="left"/>
             </w:pPr>
             <w:r>
-              <w:t xml:space="preserve">O2</w:t>
-            </w:r>
-          </w:p>
-        </w:tc>
-        <w:tc>
-          <w:p>
-            <w:pPr>
-              <w:pStyle w:val="Compact"/>
-              <w:jc w:val="left"/>
-            </w:pPr>
-            <w:r>
-              <w:t xml:space="preserve">A policy-engine layer already exists above the CBOM [P7] and a standardised object model below it [P6] — our semantic annotations slot into an established stack rather than competing with it.</w:t>
+              <w:t xml:space="preserve">W2</w:t>
+            </w:r>
+          </w:p>
+        </w:tc>
+        <w:tc>
+          <w:p>
+            <w:pPr>
+              <w:pStyle w:val="Compact"/>
+              <w:jc w:val="left"/>
+            </w:pPr>
+            <w:r>
+              <w:t xml:space="preserve">Retention ground truth requires human annotation; no public dataset exists.</w:t>
+            </w:r>
+          </w:p>
+        </w:tc>
+        <w:tc>
+          <w:p>
+            <w:pPr>
+              <w:pStyle w:val="Compact"/>
+              <w:jc w:val="left"/>
+            </w:pPr>
+            <w:r>
+              <w:t xml:space="preserve">Annotation is scoped to top-20 findings per repository (~300–400 labels), two annotators, agreement reported. Building the benchmark is reframed as contribution O6.</w:t>
             </w:r>
           </w:p>
         </w:tc>
@@ -7875,18 +9964,45 @@
               <w:jc w:val="left"/>
             </w:pPr>
             <w:r>
-              <w:t xml:space="preserve">O3</w:t>
-            </w:r>
-          </w:p>
-        </w:tc>
-        <w:tc>
-          <w:p>
-            <w:pPr>
-              <w:pStyle w:val="Compact"/>
-              <w:jc w:val="left"/>
-            </w:pPr>
-            <w:r>
-              <w:t xml:space="preserve">The retention-annotated benchmark is likely to be reused, which is how a student artefact acquires citations.</w:t>
+              <w:t xml:space="preserve">W3</w:t>
+            </w:r>
+          </w:p>
+        </w:tc>
+        <w:tc>
+          <w:p>
+            <w:pPr>
+              <w:pStyle w:val="Compact"/>
+              <w:jc w:val="left"/>
+            </w:pPr>
+            <w:r>
+              <w:t xml:space="preserve">Expert priority labels are subjective; the ranking target is partly opinion.</w:t>
+            </w:r>
+          </w:p>
+        </w:tc>
+        <w:tc>
+          <w:p>
+            <w:pPr>
+              <w:pStyle w:val="Compact"/>
+              <w:jc w:val="left"/>
+            </w:pPr>
+            <w:r>
+              <w:t xml:space="preserve">Report inter-annotator agreement; use</w:t>
+            </w:r>
+            <w:r>
+              <w:t xml:space="preserve"> </w:t>
+            </w:r>
+            <w:r>
+              <w:rPr>
+                <w:iCs/>
+                <w:i/>
+              </w:rPr>
+              <w:t xml:space="preserve">ordering</w:t>
+            </w:r>
+            <w:r>
+              <w:t xml:space="preserve"> </w:t>
+            </w:r>
+            <w:r>
+              <w:t xml:space="preserve">not absolute scores; hold out repositories; report sensitivity to weights.</w:t>
             </w:r>
           </w:p>
         </w:tc>
@@ -7899,18 +10015,29 @@
               <w:jc w:val="left"/>
             </w:pPr>
             <w:r>
-              <w:t xml:space="preserve">O4</w:t>
-            </w:r>
-          </w:p>
-        </w:tc>
-        <w:tc>
-          <w:p>
-            <w:pPr>
-              <w:pStyle w:val="Compact"/>
-              <w:jc w:val="left"/>
-            </w:pPr>
-            <w:r>
-              <w:t xml:space="preserve">Direct route to industry engagement: an Indian bank or CII operator under the 2027–2029 deadline is a willing pilot partner and a strong letter of support.</w:t>
+              <w:t xml:space="preserve">W4</w:t>
+            </w:r>
+          </w:p>
+        </w:tc>
+        <w:tc>
+          <w:p>
+            <w:pPr>
+              <w:pStyle w:val="Compact"/>
+              <w:jc w:val="left"/>
+            </w:pPr>
+            <w:r>
+              <w:t xml:space="preserve">The team has no prior static-analysis or compiler experience.</w:t>
+            </w:r>
+          </w:p>
+        </w:tc>
+        <w:tc>
+          <w:p>
+            <w:pPr>
+              <w:pStyle w:val="Compact"/>
+              <w:jc w:val="left"/>
+            </w:pPr>
+            <w:r>
+              <w:t xml:space="preserve">Build on CodeQL and Semgrep rather than a bespoke IR; month 3–4 baseline replication acts as an early competence check with a fallback (drop to intra-procedural + configuration-level binding, which still exceeds all baselines).</w:t>
             </w:r>
           </w:p>
         </w:tc>
@@ -7923,18 +10050,29 @@
               <w:jc w:val="left"/>
             </w:pPr>
             <w:r>
-              <w:t xml:space="preserve">O5</w:t>
-            </w:r>
-          </w:p>
-        </w:tc>
-        <w:tc>
-          <w:p>
-            <w:pPr>
-              <w:pStyle w:val="Compact"/>
-              <w:jc w:val="left"/>
-            </w:pPr>
-            <w:r>
-              <w:t xml:space="preserve">The ranking-evaluation protocol (O7) can be published as a short methodological paper even if the tool underperforms.</w:t>
+              <w:t xml:space="preserve">W5</w:t>
+            </w:r>
+          </w:p>
+        </w:tc>
+        <w:tc>
+          <w:p>
+            <w:pPr>
+              <w:pStyle w:val="Compact"/>
+              <w:jc w:val="left"/>
+            </w:pPr>
+            <w:r>
+              <w:t xml:space="preserve">Differential testing is unsound — it can miss inequivalence.</w:t>
+            </w:r>
+          </w:p>
+        </w:tc>
+        <w:tc>
+          <w:p>
+            <w:pPr>
+              <w:pStyle w:val="Compact"/>
+              <w:jc w:val="left"/>
+            </w:pPr>
+            <w:r>
+              <w:t xml:space="preserve">Stated as a limitation, not hidden; property tests target the specific classes round-trip testing misses.</w:t>
             </w:r>
           </w:p>
         </w:tc>
@@ -7947,31 +10085,42 @@
               <w:jc w:val="left"/>
             </w:pPr>
             <w:r>
-              <w:t xml:space="preserve">O6</w:t>
-            </w:r>
-          </w:p>
-        </w:tc>
-        <w:tc>
-          <w:p>
-            <w:pPr>
-              <w:pStyle w:val="Compact"/>
-              <w:jc w:val="left"/>
-            </w:pPr>
-            <w:r>
-              <w:t xml:space="preserve">Natural extensions: archival re-timestamping, certificate-estate ranking, extension to Go/C++ — a follow-on programme rather than a dead end.</w:t>
+              <w:t xml:space="preserve">W6</w:t>
+            </w:r>
+          </w:p>
+        </w:tc>
+        <w:tc>
+          <w:p>
+            <w:pPr>
+              <w:pStyle w:val="Compact"/>
+              <w:jc w:val="left"/>
+            </w:pPr>
+            <w:r>
+              <w:t xml:space="preserve">We cannot see into vendored binaries or closed dependencies.</w:t>
+            </w:r>
+          </w:p>
+        </w:tc>
+        <w:tc>
+          <w:p>
+            <w:pPr>
+              <w:pStyle w:val="Compact"/>
+              <w:jc w:val="left"/>
+            </w:pPr>
+            <w:r>
+              <w:t xml:space="preserve">Declared out of scope with the complementary line of work cited [P11].</w:t>
             </w:r>
           </w:p>
         </w:tc>
       </w:tr>
     </w:tbl>
-    <w:bookmarkEnd w:id="47"/>
-    <w:bookmarkStart w:id="48" w:name="threats"/>
+    <w:bookmarkEnd w:id="51"/>
+    <w:bookmarkStart w:id="52" w:name="opportunities"/>
     <w:p>
       <w:pPr>
         <w:pStyle w:val="Heading3"/>
       </w:pPr>
       <w:r>
-        <w:t xml:space="preserve">Threats</w:t>
+        <w:t xml:space="preserve">Opportunities</w:t>
       </w:r>
     </w:p>
     <w:tbl>
@@ -8000,6 +10149,192 @@
               <w:jc w:val="left"/>
             </w:pPr>
             <w:r>
+              <w:t xml:space="preserve">Opportunity</w:t>
+            </w:r>
+          </w:p>
+        </w:tc>
+      </w:tr>
+      <w:tr>
+        <w:tc>
+          <w:p>
+            <w:pPr>
+              <w:pStyle w:val="Compact"/>
+              <w:jc w:val="left"/>
+            </w:pPr>
+            <w:r>
+              <w:t xml:space="preserve">O1</w:t>
+            </w:r>
+          </w:p>
+        </w:tc>
+        <w:tc>
+          <w:p>
+            <w:pPr>
+              <w:pStyle w:val="Compact"/>
+              <w:jc w:val="left"/>
+            </w:pPr>
+            <w:r>
+              <w:t xml:space="preserve">CISA/NIST CBOM minimum elements (due under EO 14412) will define a schema target; conforming early positions the tool as reference-compatible.</w:t>
+            </w:r>
+          </w:p>
+        </w:tc>
+      </w:tr>
+      <w:tr>
+        <w:tc>
+          <w:p>
+            <w:pPr>
+              <w:pStyle w:val="Compact"/>
+              <w:jc w:val="left"/>
+            </w:pPr>
+            <w:r>
+              <w:t xml:space="preserve">O2</w:t>
+            </w:r>
+          </w:p>
+        </w:tc>
+        <w:tc>
+          <w:p>
+            <w:pPr>
+              <w:pStyle w:val="Compact"/>
+              <w:jc w:val="left"/>
+            </w:pPr>
+            <w:r>
+              <w:t xml:space="preserve">A policy-engine layer already exists above the CBOM [P7] and a standardised object model below it [P6] — our semantic annotations slot into an established stack rather than competing with it.</w:t>
+            </w:r>
+          </w:p>
+        </w:tc>
+      </w:tr>
+      <w:tr>
+        <w:tc>
+          <w:p>
+            <w:pPr>
+              <w:pStyle w:val="Compact"/>
+              <w:jc w:val="left"/>
+            </w:pPr>
+            <w:r>
+              <w:t xml:space="preserve">O3</w:t>
+            </w:r>
+          </w:p>
+        </w:tc>
+        <w:tc>
+          <w:p>
+            <w:pPr>
+              <w:pStyle w:val="Compact"/>
+              <w:jc w:val="left"/>
+            </w:pPr>
+            <w:r>
+              <w:t xml:space="preserve">The retention-annotated benchmark is likely to be reused, which is how a student artefact acquires citations.</w:t>
+            </w:r>
+          </w:p>
+        </w:tc>
+      </w:tr>
+      <w:tr>
+        <w:tc>
+          <w:p>
+            <w:pPr>
+              <w:pStyle w:val="Compact"/>
+              <w:jc w:val="left"/>
+            </w:pPr>
+            <w:r>
+              <w:t xml:space="preserve">O4</w:t>
+            </w:r>
+          </w:p>
+        </w:tc>
+        <w:tc>
+          <w:p>
+            <w:pPr>
+              <w:pStyle w:val="Compact"/>
+              <w:jc w:val="left"/>
+            </w:pPr>
+            <w:r>
+              <w:t xml:space="preserve">Direct route to industry engagement: an Indian bank or CII operator under the 2027–2029 deadline is a willing pilot partner and a strong letter of support.</w:t>
+            </w:r>
+          </w:p>
+        </w:tc>
+      </w:tr>
+      <w:tr>
+        <w:tc>
+          <w:p>
+            <w:pPr>
+              <w:pStyle w:val="Compact"/>
+              <w:jc w:val="left"/>
+            </w:pPr>
+            <w:r>
+              <w:t xml:space="preserve">O5</w:t>
+            </w:r>
+          </w:p>
+        </w:tc>
+        <w:tc>
+          <w:p>
+            <w:pPr>
+              <w:pStyle w:val="Compact"/>
+              <w:jc w:val="left"/>
+            </w:pPr>
+            <w:r>
+              <w:t xml:space="preserve">The ranking-evaluation protocol (O7) can be published as a short methodological paper even if the tool underperforms.</w:t>
+            </w:r>
+          </w:p>
+        </w:tc>
+      </w:tr>
+      <w:tr>
+        <w:tc>
+          <w:p>
+            <w:pPr>
+              <w:pStyle w:val="Compact"/>
+              <w:jc w:val="left"/>
+            </w:pPr>
+            <w:r>
+              <w:t xml:space="preserve">O6</w:t>
+            </w:r>
+          </w:p>
+        </w:tc>
+        <w:tc>
+          <w:p>
+            <w:pPr>
+              <w:pStyle w:val="Compact"/>
+              <w:jc w:val="left"/>
+            </w:pPr>
+            <w:r>
+              <w:t xml:space="preserve">Natural extensions: archival re-timestamping, certificate-estate ranking, extension to Go/C++ — a follow-on programme rather than a dead end.</w:t>
+            </w:r>
+          </w:p>
+        </w:tc>
+      </w:tr>
+    </w:tbl>
+    <w:bookmarkEnd w:id="52"/>
+    <w:bookmarkStart w:id="53" w:name="threats"/>
+    <w:p>
+      <w:pPr>
+        <w:pStyle w:val="Heading3"/>
+      </w:pPr>
+      <w:r>
+        <w:t xml:space="preserve">Threats</w:t>
+      </w:r>
+    </w:p>
+    <w:tbl>
+      <w:tblPr>
+        <w:tblStyle w:val="Table"/>
+        <w:tblW w:type="pct" w:w="0.0"/>
+        <w:tblLook w:firstRow="1" w:lastRow="0" w:firstColumn="0" w:lastColumn="0" w:noHBand="0" w:noVBand="0" w:val="0020"/>
+      </w:tblPr>
+      <w:tblGrid/>
+      <w:tr>
+        <w:tc>
+          <w:p>
+            <w:pPr>
+              <w:pStyle w:val="Compact"/>
+              <w:jc w:val="left"/>
+            </w:pPr>
+            <w:r>
+              <w:t xml:space="preserve">#</w:t>
+            </w:r>
+          </w:p>
+        </w:tc>
+        <w:tc>
+          <w:p>
+            <w:pPr>
+              <w:pStyle w:val="Compact"/>
+              <w:jc w:val="left"/>
+            </w:pPr>
+            <w:r>
               <w:t xml:space="preserve">Threat</w:t>
             </w:r>
           </w:p>
@@ -8302,9 +10637,9 @@
         </w:pict>
       </w:r>
     </w:p>
-    <w:bookmarkEnd w:id="48"/>
-    <w:bookmarkEnd w:id="49"/>
-    <w:bookmarkStart w:id="50" w:name="Xb7a5ee4ce8e05a16b8feeb446a835d6396720f4"/>
+    <w:bookmarkEnd w:id="53"/>
+    <w:bookmarkEnd w:id="54"/>
+    <w:bookmarkStart w:id="55" w:name="Xb7a5ee4ce8e05a16b8feeb446a835d6396720f4"/>
     <w:p>
       <w:pPr>
         <w:pStyle w:val="Heading2"/>
@@ -8549,8 +10884,8 @@
         <w:br w:type="page"/>
       </w:r>
     </w:p>
-    <w:bookmarkEnd w:id="50"/>
-    <w:bookmarkStart w:id="63" w:name="X3b4c3db7819ed66f453f0c9b146c43e80460b49"/>
+    <w:bookmarkEnd w:id="55"/>
+    <w:bookmarkStart w:id="70" w:name="X3b4c3db7819ed66f453f0c9b146c43e80460b49"/>
     <w:p>
       <w:pPr>
         <w:pStyle w:val="Heading2"/>
@@ -8595,7 +10930,7 @@
       <w:r>
         <w:t xml:space="preserve"> </w:t>
       </w:r>
-      <w:hyperlink r:id="rId51">
+      <w:hyperlink r:id="rId56">
         <w:r>
           <w:rPr>
             <w:rStyle w:val="Hyperlink"/>
@@ -8640,7 +10975,7 @@
       <w:r>
         <w:t xml:space="preserve"> </w:t>
       </w:r>
-      <w:hyperlink r:id="rId52">
+      <w:hyperlink r:id="rId57">
         <w:r>
           <w:rPr>
             <w:rStyle w:val="Hyperlink"/>
@@ -8685,7 +11020,7 @@
       <w:r>
         <w:t xml:space="preserve"> </w:t>
       </w:r>
-      <w:hyperlink r:id="rId53">
+      <w:hyperlink r:id="rId58">
         <w:r>
           <w:rPr>
             <w:rStyle w:val="Hyperlink"/>
@@ -8730,7 +11065,7 @@
       <w:r>
         <w:t xml:space="preserve"> </w:t>
       </w:r>
-      <w:hyperlink r:id="rId54">
+      <w:hyperlink r:id="rId59">
         <w:r>
           <w:rPr>
             <w:rStyle w:val="Hyperlink"/>
@@ -8775,7 +11110,7 @@
       <w:r>
         <w:t xml:space="preserve"> </w:t>
       </w:r>
-      <w:hyperlink r:id="rId55">
+      <w:hyperlink r:id="rId60">
         <w:r>
           <w:rPr>
             <w:rStyle w:val="Hyperlink"/>
@@ -8820,7 +11155,7 @@
       <w:r>
         <w:t xml:space="preserve"> </w:t>
       </w:r>
-      <w:hyperlink r:id="rId56">
+      <w:hyperlink r:id="rId61">
         <w:r>
           <w:rPr>
             <w:rStyle w:val="Hyperlink"/>
@@ -8859,7 +11194,7 @@
       <w:r>
         <w:t xml:space="preserve"> </w:t>
       </w:r>
-      <w:hyperlink r:id="rId57">
+      <w:hyperlink r:id="rId62">
         <w:r>
           <w:rPr>
             <w:rStyle w:val="Hyperlink"/>
@@ -8898,7 +11233,7 @@
       <w:r>
         <w:t xml:space="preserve"> </w:t>
       </w:r>
-      <w:hyperlink r:id="rId58">
+      <w:hyperlink r:id="rId63">
         <w:r>
           <w:rPr>
             <w:rStyle w:val="Hyperlink"/>
@@ -8937,7 +11272,7 @@
       <w:r>
         <w:t xml:space="preserve"> </w:t>
       </w:r>
-      <w:hyperlink r:id="rId59">
+      <w:hyperlink r:id="rId64">
         <w:r>
           <w:rPr>
             <w:rStyle w:val="Hyperlink"/>
@@ -8976,7 +11311,7 @@
       <w:r>
         <w:t xml:space="preserve"> </w:t>
       </w:r>
-      <w:hyperlink r:id="rId60">
+      <w:hyperlink r:id="rId65">
         <w:r>
           <w:rPr>
             <w:rStyle w:val="Hyperlink"/>
@@ -9015,7 +11350,7 @@
       <w:r>
         <w:t xml:space="preserve"> </w:t>
       </w:r>
-      <w:hyperlink r:id="rId61">
+      <w:hyperlink r:id="rId66">
         <w:r>
           <w:rPr>
             <w:rStyle w:val="Hyperlink"/>
@@ -9054,7 +11389,7 @@
       <w:r>
         <w:t xml:space="preserve"> </w:t>
       </w:r>
-      <w:hyperlink r:id="rId62">
+      <w:hyperlink r:id="rId67">
         <w:r>
           <w:rPr>
             <w:rStyle w:val="Hyperlink"/>
@@ -9106,6 +11441,124 @@
           <w:bCs/>
           <w:b/>
         </w:rPr>
+        <w:t xml:space="preserve">[P14]</w:t>
+      </w:r>
+      <w:r>
+        <w:t xml:space="preserve"> </w:t>
+      </w:r>
+      <w:r>
+        <w:t xml:space="preserve">C. Näther et al.</w:t>
+      </w:r>
+      <w:r>
+        <w:t xml:space="preserve"> </w:t>
+      </w:r>
+      <w:r>
+        <w:rPr>
+          <w:iCs/>
+          <w:i/>
+        </w:rPr>
+        <w:t xml:space="preserve">Migrating Software Systems towards Post-Quantum Cryptography: A Systematic Literature Review.</w:t>
+      </w:r>
+      <w:r>
+        <w:t xml:space="preserve"> </w:t>
+      </w:r>
+      <w:r>
+        <w:t xml:space="preserve">arXiv:2404.12854, April 2024.</w:t>
+      </w:r>
+      <w:r>
+        <w:t xml:space="preserve"> </w:t>
+      </w:r>
+      <w:hyperlink r:id="rId68">
+        <w:r>
+          <w:rPr>
+            <w:rStyle w:val="Hyperlink"/>
+          </w:rPr>
+          <w:t xml:space="preserve">https://arxiv.org/abs/2404.12854</w:t>
+        </w:r>
+      </w:hyperlink>
+    </w:p>
+    <w:p>
+      <w:pPr>
+        <w:pStyle w:val="BodyText"/>
+      </w:pPr>
+      <w:r>
+        <w:rPr>
+          <w:bCs/>
+          <w:b/>
+        </w:rPr>
+        <w:t xml:space="preserve">[P15]</w:t>
+      </w:r>
+      <w:r>
+        <w:t xml:space="preserve"> </w:t>
+      </w:r>
+      <w:r>
+        <w:rPr>
+          <w:iCs/>
+          <w:i/>
+        </w:rPr>
+        <w:t xml:space="preserve">Harvest Now, Decrypt Later: Examining Post-Quantum Risk.</w:t>
+      </w:r>
+      <w:r>
+        <w:t xml:space="preserve"> </w:t>
+      </w:r>
+      <w:r>
+        <w:t xml:space="preserve">Finance and Economics Discussion Series, Board of Governors of the Federal Reserve System, 2025.</w:t>
+      </w:r>
+      <w:r>
+        <w:t xml:space="preserve"> </w:t>
+      </w:r>
+      <w:hyperlink r:id="rId69">
+        <w:r>
+          <w:rPr>
+            <w:rStyle w:val="Hyperlink"/>
+          </w:rPr>
+          <w:t xml:space="preserve">https://www.federalreserve.gov/econres/feds/files/2025093pap.pdf</w:t>
+        </w:r>
+      </w:hyperlink>
+    </w:p>
+    <w:p>
+      <w:pPr>
+        <w:pStyle w:val="BodyText"/>
+      </w:pPr>
+      <w:r>
+        <w:rPr>
+          <w:bCs/>
+          <w:b/>
+        </w:rPr>
+        <w:t xml:space="preserve">[P16]</w:t>
+      </w:r>
+      <w:r>
+        <w:t xml:space="preserve"> </w:t>
+      </w:r>
+      <w:r>
+        <w:t xml:space="preserve">S. Krüger et al.</w:t>
+      </w:r>
+      <w:r>
+        <w:t xml:space="preserve"> </w:t>
+      </w:r>
+      <w:r>
+        <w:rPr>
+          <w:iCs/>
+          <w:i/>
+        </w:rPr>
+        <w:t xml:space="preserve">CogniCrypt: Supporting Developers in Using Cryptography.</w:t>
+      </w:r>
+      <w:r>
+        <w:t xml:space="preserve"> </w:t>
+      </w:r>
+      <w:r>
+        <w:t xml:space="preserve">IEEE/ACM ASE 2017.</w:t>
+      </w:r>
+    </w:p>
+    <w:p>
+      <w:pPr>
+        <w:pStyle w:val="BodyText"/>
+      </w:pPr>
+      <w:r>
+        <w:rPr>
+          <w:bCs/>
+          <w:b/>
+        </w:rPr>
         <w:t xml:space="preserve">Standards and regulatory sources.</w:t>
       </w:r>
       <w:r>
@@ -9133,8 +11586,8 @@
         <w:t xml:space="preserve">2025.</w:t>
       </w:r>
     </w:p>
-    <w:bookmarkEnd w:id="63"/>
-    <w:bookmarkEnd w:id="64"/>
+    <w:bookmarkEnd w:id="70"/>
+    <w:bookmarkEnd w:id="71"/>
     <w:sectPr/>
   </w:body>
 </w:document>

</xml_diff>